<commit_message>
Báo cáo nội dung 1: sửa lỗi hiển thị (Q4_K_M, tên file review_*.py, đường dẫn trong dấu backtick); xuất PDF bằng Word
Chỉ đổi định dạng, nội dung và số liệu giữ nguyên: hàm rich() không còn coi dấu _ giữa từ là in nghiêng, chữ trong backtick hiển thị bằng font Consolas. build_report.py xuất thêm PDF bằng Microsoft Word (trước đây PDF xuất qua trình duyệt).
</commit_message>
<xml_diff>
--- a/report/Bao_cao_Y1.docx
+++ b/report/Bao_cao_Y1.docx
@@ -555,20 +555,7 @@
               <w:rPr>
                 <w:sz w:val="22"/>
               </w:rPr>
-              <w:t>qwen2.5:7b (Q4</w:t>
-            </w:r>
-            <w:r>
-              <w:rPr>
-                <w:i/>
-                <w:sz w:val="22"/>
-              </w:rPr>
-              <w:t>K</w:t>
-            </w:r>
-            <w:r>
-              <w:rPr>
-                <w:sz w:val="22"/>
-              </w:rPr>
-              <w:t>M, digest 845dbda0ea48)</w:t>
+              <w:t>qwen2.5:7b (Q4_K_M, digest 845dbda0ea48)</w:t>
             </w:r>
           </w:p>
         </w:tc>
@@ -616,20 +603,7 @@
               <w:rPr>
                 <w:sz w:val="22"/>
               </w:rPr>
-              <w:t>llama3.1:8b (Q4</w:t>
-            </w:r>
-            <w:r>
-              <w:rPr>
-                <w:i/>
-                <w:sz w:val="22"/>
-              </w:rPr>
-              <w:t>K</w:t>
-            </w:r>
-            <w:r>
-              <w:rPr>
-                <w:sz w:val="22"/>
-              </w:rPr>
-              <w:t>M, digest 46e0c10c039e)</w:t>
+              <w:t>llama3.1:8b (Q4_K_M, digest 46e0c10c039e)</w:t>
             </w:r>
           </w:p>
         </w:tc>
@@ -739,7 +713,16 @@
         <w:ind w:firstLine="567"/>
       </w:pPr>
       <w:r>
-        <w:t>Trong quá trình chạy, Ollama tự cập nhật từ 0.35.0 lên 0.35.1; phần cuối của điều kiện top-k = 8 chạy trên 0.35.1, digest của ba mô hình không đổi. Version của từng lần chạy được ghi trong `results/&lt;run&gt;/run_info.json`.</w:t>
+        <w:t xml:space="preserve">Trong quá trình chạy, Ollama tự cập nhật từ 0.35.0 lên 0.35.1; phần cuối của điều kiện top-k = 8 chạy trên 0.35.1, digest của ba mô hình không đổi. Version của từng lần chạy được ghi trong </w:t>
+      </w:r>
+      <w:r>
+        <w:rPr>
+          <w:rFonts w:ascii="Consolas" w:hAnsi="Consolas"/>
+        </w:rPr>
+        <w:t>results/&lt;run&gt;/run_info.json</w:t>
+      </w:r>
+      <w:r>
+        <w:t>.</w:t>
       </w:r>
     </w:p>
     <w:p>
@@ -755,7 +738,61 @@
         <w:ind w:firstLine="567"/>
       </w:pPr>
       <w:r>
-        <w:t>Mã nguồn, bộ câu hỏi, kết quả và dữ liệu đều có trong repository: `data/chunks.jsonl` (văn bản các chunk), `data/chroma.zip` (cơ sở dữ liệu vector đúng như lúc chạy, tự giải nén ở lần chạy đầu), `data/MANIFEST.json` (số lượng, mã sha256, tham số chunking, version). `requirements.txt` ghi đúng version thư viện và mỗi lần đánh giá lưu lại version môi trường trong `results/&lt;run&gt;/run_info.json`. Sau khi cài Ollama và tải ba mô hình, chạy lại toàn bộ đánh giá bằng `python evaluate.py`.</w:t>
+        <w:t xml:space="preserve">Mã nguồn, bộ câu hỏi, kết quả và dữ liệu đều có trong repository: </w:t>
+      </w:r>
+      <w:r>
+        <w:rPr>
+          <w:rFonts w:ascii="Consolas" w:hAnsi="Consolas"/>
+        </w:rPr>
+        <w:t>data/chunks.jsonl</w:t>
+      </w:r>
+      <w:r>
+        <w:t xml:space="preserve"> (văn bản các chunk), </w:t>
+      </w:r>
+      <w:r>
+        <w:rPr>
+          <w:rFonts w:ascii="Consolas" w:hAnsi="Consolas"/>
+        </w:rPr>
+        <w:t>data/chroma.zip</w:t>
+      </w:r>
+      <w:r>
+        <w:t xml:space="preserve"> (cơ sở dữ liệu vector đúng như lúc chạy, tự giải nén ở lần chạy đầu), </w:t>
+      </w:r>
+      <w:r>
+        <w:rPr>
+          <w:rFonts w:ascii="Consolas" w:hAnsi="Consolas"/>
+        </w:rPr>
+        <w:t>data/MANIFEST.json</w:t>
+      </w:r>
+      <w:r>
+        <w:t xml:space="preserve"> (số lượng, mã sha256, tham số chunking, version). </w:t>
+      </w:r>
+      <w:r>
+        <w:rPr>
+          <w:rFonts w:ascii="Consolas" w:hAnsi="Consolas"/>
+        </w:rPr>
+        <w:t>requirements.txt</w:t>
+      </w:r>
+      <w:r>
+        <w:t xml:space="preserve"> ghi đúng version thư viện và mỗi lần đánh giá lưu lại version môi trường trong </w:t>
+      </w:r>
+      <w:r>
+        <w:rPr>
+          <w:rFonts w:ascii="Consolas" w:hAnsi="Consolas"/>
+        </w:rPr>
+        <w:t>results/&lt;run&gt;/run_info.json</w:t>
+      </w:r>
+      <w:r>
+        <w:t xml:space="preserve">. Sau khi cài Ollama và tải ba mô hình, chạy lại toàn bộ đánh giá bằng </w:t>
+      </w:r>
+      <w:r>
+        <w:rPr>
+          <w:rFonts w:ascii="Consolas" w:hAnsi="Consolas"/>
+        </w:rPr>
+        <w:t>python evaluate.py</w:t>
+      </w:r>
+      <w:r>
+        <w:t>.</w:t>
       </w:r>
     </w:p>
     <w:p>
@@ -1620,16 +1657,25 @@
         <w:ind w:firstLine="567"/>
       </w:pPr>
       <w:r>
-        <w:t>Khi duyệt tay, mỗi câu được đối chiếu với đoạn văn gốc: sửa câu hỏi cho rõ và tự đứng được, sửa đáp án cho đúng với đoạn văn; loại câu hỏi về công thức bị lỗi ký tự, câu chỉ hỏi tên tác giả, và với multi-hop là các câu ghép hai ý không liên quan hoặc thực chất chỉ cần một bài. Lý do loại và nội dung sửa của từng câu được lưu trong `testset/review</w:t>
+        <w:t xml:space="preserve">Khi duyệt tay, mỗi câu được đối chiếu với đoạn văn gốc: sửa câu hỏi cho rõ và tự đứng được, sửa đáp án cho đúng với đoạn văn; loại câu hỏi về công thức bị lỗi ký tự, câu chỉ hỏi tên tác giả, và với multi-hop là các câu ghép hai ý không liên quan hoặc thực chất chỉ cần một bài. Lý do loại và nội dung sửa của từng câu được lưu trong </w:t>
       </w:r>
       <w:r>
         <w:rPr>
-          <w:i/>
+          <w:rFonts w:ascii="Consolas" w:hAnsi="Consolas"/>
         </w:rPr>
-        <w:t>edits.py` và `testset/review</w:t>
+        <w:t>testset/review_edits.py</w:t>
       </w:r>
       <w:r>
-        <w:t xml:space="preserve">multihop.py`. Ngoài ba loại câu hỏi, điều kiện </w:t>
+        <w:t xml:space="preserve"> và </w:t>
+      </w:r>
+      <w:r>
+        <w:rPr>
+          <w:rFonts w:ascii="Consolas" w:hAnsi="Consolas"/>
+        </w:rPr>
+        <w:t>testset/review_multihop.py</w:t>
+      </w:r>
+      <w:r>
+        <w:t xml:space="preserve">. Ngoài ba loại câu hỏi, điều kiện </w:t>
       </w:r>
       <w:r>
         <w:rPr>

</xml_diff>

<commit_message>
Sửa nội dung 1–4 theo bản đánh giá: thống kê, tách hallucination khỏi refusal, kết luận
- report/stat_utils.py: bootstrap với seed cố định cho từng lần (cùng dữ liệu luôn cùng CI), hiệu chỉnh Holm cho mỗi bảng paired difference, nhóm kết cục
- Nội dung 1: Self-RAG xấp xỉ bằng prompt; mục 7.5 nhóm kết cục, risk–coverage, hallucination mức claim; nguồn gốc prompt ISSUP
- Nội dung 2: nhóm kết cục, tách theo nhóm bài nguồn, giải thích chênh lệch human judge – judge; kết luận nêu chỉ số không qua judge, mật độ KG; ghi rõ model và phiên bản bài Han et al.
- Nội dung 3: tiêu chí "đủ" (non-inferiority, δ = 10 điểm %), kết cục theo số bài nguồn trong KG
- Nội dung 4: mức giảm faithfulness chưa loại trừ được, độ dài context và judge
- Khuôn phiếu chấm tay chuyển vào testset/human_judge/template.html
</commit_message>
<xml_diff>
--- a/report/Bao_cao_Y1.docx
+++ b/report/Bao_cao_Y1.docx
@@ -44,6 +44,18 @@
           <w:sz w:val="44"/>
         </w:rPr>
         <w:t>So sánh LangChain RAG thuần và LangGraph Self-RAG</w:t>
+      </w:r>
+    </w:p>
+    <w:p>
+      <w:pPr>
+        <w:jc w:val="center"/>
+      </w:pPr>
+      <w:r>
+        <w:rPr>
+          <w:color w:val="52514E"/>
+          <w:sz w:val="28"/>
+        </w:rPr>
+        <w:t>(Self-RAG xấp xỉ bằng prompt trên mô hình 7B)</w:t>
       </w:r>
     </w:p>
     <w:p>
@@ -1276,6 +1288,14 @@
     </w:p>
     <w:p>
       <w:pPr>
+        <w:ind w:firstLine="567"/>
+      </w:pPr>
+      <w:r>
+        <w:t>Prompt ISSUP được viết lại sau vòng chạy đầu tiên trên chính 86 câu single-hop của bộ đánh giá (không có tập dev riêng). Ở vòng đó, với prompt ISSUP ban đầu (chỉ yêu cầu "mọi ý được tài liệu hỗ trợ", không có định nghĩa và few-shot), Self-RAG refuse 11/86 câu, trong đó 4 câu do bước ISSUP liên tục chấm "không có căn cứ" (7 câu còn lại do bước chấm độ liên quan không giữ được tài liệu nào), và 10 câu phải sinh lại câu trả lời. Vì vậy ở câu single-hop, hệ B có thể được lợi nhẹ so với hệ A do prompt được chỉnh sau khi xem hành vi trên cùng bộ câu hỏi; dù vậy, ở câu single-hop vẫn không đủ bằng chứng để phân biệt hai hệ (mục 7.1). Câu multi-hop và out-of-corpus được đưa vào bộ đánh giá trong cùng đợt cập nhật với prompt mới, không có ở vòng chạy đầu. Các vòng chạy được lưu trong lịch sử git của repository.</w:t>
+      </w:r>
+    </w:p>
+    <w:p>
+      <w:pPr>
         <w:pStyle w:val="Heading1"/>
       </w:pPr>
       <w:r>
@@ -2002,7 +2022,7 @@
         <w:t xml:space="preserve">Thống kê: </w:t>
       </w:r>
       <w:r>
-        <w:t>mỗi chỉ số có CI 95% (bootstrap 2000 lần). Paired difference giữa hai hệ được kiểm định trên cùng câu hỏi (bootstrap); hallucination dùng thêm kiểm định McNemar.</w:t>
+        <w:t>mỗi chỉ số có CI 95% (bootstrap 2000 lần, seed cố định cho từng lần bootstrap nên cùng dữ liệu luôn cho cùng CI). Paired difference giữa hai hệ được kiểm định trên cùng câu hỏi (bootstrap 5000 lần); hallucination dùng thêm kiểm định McNemar. Mỗi bảng paired difference là một họ so sánh (2 loại câu × 3 chỉ số) và p được hiệu chỉnh đa so sánh theo Holm; chỉ chênh lệch qua được hiệu chỉnh mới được gọi là có statistical significance, chênh lệch có CI 95% không chứa 0 nhưng không qua hiệu chỉnh được ghi là gợi ý.</w:t>
       </w:r>
     </w:p>
     <w:p>
@@ -2249,7 +2269,7 @@
               <w:rPr>
                 <w:sz w:val="21"/>
               </w:rPr>
-              <w:t>0,759 [0,707; 0,807]</w:t>
+              <w:t>0,759 [0,706; 0,804]</w:t>
             </w:r>
           </w:p>
         </w:tc>
@@ -2267,7 +2287,7 @@
               <w:rPr>
                 <w:sz w:val="21"/>
               </w:rPr>
-              <w:t>30,2% [20,9%; 40,7%]</w:t>
+              <w:t>30,2% [20,9%; 39,5%]</w:t>
             </w:r>
           </w:p>
         </w:tc>
@@ -2327,7 +2347,7 @@
               <w:rPr>
                 <w:sz w:val="21"/>
               </w:rPr>
-              <w:t>0,905 [0,871; 0,937] (n = 80)</w:t>
+              <w:t>0,905 [0,872; 0,937] (n = 80)</w:t>
             </w:r>
           </w:p>
         </w:tc>
@@ -2346,7 +2366,7 @@
               <w:rPr>
                 <w:sz w:val="21"/>
               </w:rPr>
-              <w:t>0,763 [0,712; 0,807]</w:t>
+              <w:t>0,763 [0,710; 0,805]</w:t>
             </w:r>
           </w:p>
         </w:tc>
@@ -2365,7 +2385,7 @@
               <w:rPr>
                 <w:sz w:val="21"/>
               </w:rPr>
-              <w:t>32,6% [22,1%; 43,0%]</w:t>
+              <w:t>32,6% [23,3%; 43,0%]</w:t>
             </w:r>
           </w:p>
         </w:tc>
@@ -2429,7 +2449,7 @@
               <w:rPr>
                 <w:sz w:val="21"/>
               </w:rPr>
-              <w:t>0,776 [0,727; 0,826] (n = 30)</w:t>
+              <w:t>0,776 [0,724; 0,826] (n = 30)</w:t>
             </w:r>
           </w:p>
         </w:tc>
@@ -2447,7 +2467,7 @@
               <w:rPr>
                 <w:sz w:val="21"/>
               </w:rPr>
-              <w:t>0,703 [0,598; 0,795]</w:t>
+              <w:t>0,703 [0,603; 0,788]</w:t>
             </w:r>
           </w:p>
         </w:tc>
@@ -2465,7 +2485,7 @@
               <w:rPr>
                 <w:sz w:val="21"/>
               </w:rPr>
-              <w:t>71,4% [54,3%; 85,7%]</w:t>
+              <w:t>71,4% [57,1%; 85,7%]</w:t>
             </w:r>
           </w:p>
         </w:tc>
@@ -2525,7 +2545,7 @@
               <w:rPr>
                 <w:sz w:val="21"/>
               </w:rPr>
-              <w:t>0,831 [0,775; 0,889] (n = 18)</w:t>
+              <w:t>0,831 [0,771; 0,891] (n = 18)</w:t>
             </w:r>
           </w:p>
         </w:tc>
@@ -2544,7 +2564,7 @@
               <w:rPr>
                 <w:sz w:val="21"/>
               </w:rPr>
-              <w:t>0,419 [0,282; 0,556]</w:t>
+              <w:t>0,419 [0,283; 0,554]</w:t>
             </w:r>
           </w:p>
         </w:tc>
@@ -2837,7 +2857,7 @@
         <w:jc w:val="center"/>
       </w:pPr>
       <w:r>
-        <w:t>Bảng 6. Paired difference Self-RAG − LangChain RAG, top-k = 4</w:t>
+        <w:t>Bảng 6. Paired difference Self-RAG − LangChain RAG, top-k = 4 (in đậm: còn statistical significance sau hiệu chỉnh Holm cho 6 so sánh của bảng)</w:t>
       </w:r>
     </w:p>
     <w:tbl>
@@ -2985,7 +3005,7 @@
               <w:rPr>
                 <w:sz w:val="21"/>
               </w:rPr>
-              <w:t>+0,017 (p ≈ 0,39)</w:t>
+              <w:t>+0,017 (p ≈ 0,39; Holm ≈ 1,00)</w:t>
             </w:r>
           </w:p>
         </w:tc>
@@ -3003,7 +3023,7 @@
               <w:rPr>
                 <w:sz w:val="21"/>
               </w:rPr>
-              <w:t>+0,003 (p ≈ 0,87)</w:t>
+              <w:t>+0,003 (p ≈ 0,85; Holm ≈ 1,00)</w:t>
             </w:r>
           </w:p>
         </w:tc>
@@ -3021,7 +3041,7 @@
               <w:rPr>
                 <w:sz w:val="21"/>
               </w:rPr>
-              <w:t>+2,3 điểm % (p ≈ 0,75)</w:t>
+              <w:t>+2,3 điểm % (p ≈ 0,72; Holm ≈ 1,00)</w:t>
             </w:r>
           </w:p>
         </w:tc>
@@ -3069,7 +3089,7 @@
               <w:rPr>
                 <w:sz w:val="21"/>
               </w:rPr>
-              <w:t>+0,074 (p ≈ 0,01)</w:t>
+              <w:t>+0,074 (p ≈ 0,02; Holm ≈ 0,07)</w:t>
             </w:r>
           </w:p>
         </w:tc>
@@ -3086,9 +3106,10 @@
             <w:r/>
             <w:r>
               <w:rPr>
+                <w:b/>
                 <w:sz w:val="21"/>
               </w:rPr>
-              <w:t>-0,284 (p &lt; 0,001)</w:t>
+              <w:t>-0,284 (p &lt; 0,001; Holm &lt; 0,001)</w:t>
             </w:r>
           </w:p>
         </w:tc>
@@ -3105,9 +3126,10 @@
             <w:r/>
             <w:r>
               <w:rPr>
+                <w:b/>
                 <w:sz w:val="21"/>
               </w:rPr>
-              <w:t>-34,3 điểm % (p &lt; 0,001)</w:t>
+              <w:t>-34,3 điểm % (p &lt; 0,001; Holm &lt; 0,001)</w:t>
             </w:r>
           </w:p>
         </w:tc>
@@ -3178,7 +3200,7 @@
         <w:t>Single-hop:</w:t>
       </w:r>
       <w:r>
-        <w:t xml:space="preserve"> không đủ bằng chứng để phân biệt hai hệ trên cả ba chỉ số (faithfulness 0,890 so với 0,905, answer relevancy 0,759 so với 0,763, hallucination rate 30,2% so với 32,6%); không paired difference nào có statistical significance (p ≈ 0,39, p ≈ 0,87, p ≈ 0,75). Theo từng câu, Self-RAG sửa được 9 câu RAG thuần bị hallucination nhưng phát sinh 11 câu mới. Với loại câu hỏi dễ này, RAG thuần đã truy xuất đúng bài báo ở 97% số câu, nên vòng tự đánh giá có ít việc để cải thiện.</w:t>
+        <w:t xml:space="preserve"> không đủ bằng chứng để phân biệt hai hệ trên cả ba chỉ số (faithfulness 0,890 so với 0,905, answer relevancy 0,759 so với 0,763, hallucination rate 30,2% so với 32,6%); không paired difference nào có statistical significance (p ≈ 0,39, p ≈ 0,85, p ≈ 0,72). Theo từng câu, Self-RAG sửa được 9 câu RAG thuần bị hallucination nhưng phát sinh 11 câu mới. Với loại câu hỏi dễ này, RAG thuần đã truy xuất đúng bài báo ở 97% số câu, nên vòng tự đánh giá có ít việc để cải thiện.</w:t>
       </w:r>
     </w:p>
     <w:p>
@@ -3192,7 +3214,7 @@
         <w:t>Multi-hop:</w:t>
       </w:r>
       <w:r>
-        <w:t xml:space="preserve"> Self-RAG có hallucination rate thấp hơn rõ rệt (37,1% so với 71,4%, p &lt; 0,001; McNemar: 12 câu chỉ RAG thuần bị hallucination, 0 câu chỉ Self-RAG, p &lt; 0,001) và faithfulness cao hơn (0,831 so với 0,776, p ≈ 0,01, tính trên 18 câu cả hai hệ cùng trả lời). Ngược lại answer relevancy thấp hơn rõ rệt (0,419 so với 0,703, p &lt; 0,001) vì Self-RAG refuse 49% số câu (RAG thuần 14%).</w:t>
+        <w:t xml:space="preserve"> Self-RAG có hallucination rate thấp hơn rõ rệt (37,1% so với 71,4%, p &lt; 0,001; McNemar: 12 câu chỉ RAG thuần bị hallucination, 0 câu chỉ Self-RAG, p &lt; 0,001) và faithfulness có xu hướng cao hơn (0,831 so với 0,776, p ≈ 0,02, sau hiệu chỉnh Holm p_Holm ≈ 0,07, nên chỉ là gợi ý, tính trên 18 câu cả hai hệ cùng trả lời, mục 7.5). Ngược lại answer relevancy thấp hơn rõ rệt (0,419 so với 0,703, p &lt; 0,001) vì Self-RAG refuse 49% số câu (RAG thuần 14%).</w:t>
       </w:r>
     </w:p>
     <w:p>
@@ -3643,7 +3665,7 @@
               <w:rPr>
                 <w:sz w:val="21"/>
               </w:rPr>
-              <w:t>0,898 [0,860; 0,932] (n = 81)</w:t>
+              <w:t>0,898 [0,862; 0,932] (n = 81)</w:t>
             </w:r>
           </w:p>
         </w:tc>
@@ -3661,7 +3683,7 @@
               <w:rPr>
                 <w:sz w:val="21"/>
               </w:rPr>
-              <w:t>0,776 [0,729; 0,816]</w:t>
+              <w:t>0,776 [0,729; 0,814]</w:t>
             </w:r>
           </w:p>
         </w:tc>
@@ -3758,7 +3780,7 @@
               <w:rPr>
                 <w:sz w:val="21"/>
               </w:rPr>
-              <w:t>0,776 [0,731; 0,816]</w:t>
+              <w:t>0,776 [0,728; 0,816]</w:t>
             </w:r>
           </w:p>
         </w:tc>
@@ -3777,7 +3799,7 @@
               <w:rPr>
                 <w:sz w:val="21"/>
               </w:rPr>
-              <w:t>27,9% [18,6%; 37,2%]</w:t>
+              <w:t>27,9% [18,6%; 38,4%]</w:t>
             </w:r>
           </w:p>
         </w:tc>
@@ -3841,7 +3863,7 @@
               <w:rPr>
                 <w:sz w:val="21"/>
               </w:rPr>
-              <w:t>0,830 [0,767; 0,885] (n = 32)</w:t>
+              <w:t>0,830 [0,768; 0,892] (n = 32)</w:t>
             </w:r>
           </w:p>
         </w:tc>
@@ -3859,7 +3881,7 @@
               <w:rPr>
                 <w:sz w:val="21"/>
               </w:rPr>
-              <w:t>0,747 [0,661; 0,816]</w:t>
+              <w:t>0,747 [0,664; 0,816]</w:t>
             </w:r>
           </w:p>
         </w:tc>
@@ -3937,7 +3959,7 @@
               <w:rPr>
                 <w:sz w:val="21"/>
               </w:rPr>
-              <w:t>0,806 [0,733; 0,880] (n = 18)</w:t>
+              <w:t>0,806 [0,727; 0,877] (n = 18)</w:t>
             </w:r>
           </w:p>
         </w:tc>
@@ -3956,7 +3978,7 @@
               <w:rPr>
                 <w:sz w:val="21"/>
               </w:rPr>
-              <w:t>0,420 [0,280; 0,548]</w:t>
+              <w:t>0,420 [0,280; 0,553]</w:t>
             </w:r>
           </w:p>
         </w:tc>
@@ -4002,7 +4024,7 @@
         <w:jc w:val="center"/>
       </w:pPr>
       <w:r>
-        <w:t>Bảng 9. Paired difference Self-RAG − LangChain RAG, top-k = 8</w:t>
+        <w:t>Bảng 9. Paired difference Self-RAG − LangChain RAG, top-k = 8 (in đậm: còn statistical significance sau hiệu chỉnh Holm cho 6 so sánh của bảng)</w:t>
       </w:r>
     </w:p>
     <w:tbl>
@@ -4150,7 +4172,7 @@
               <w:rPr>
                 <w:sz w:val="21"/>
               </w:rPr>
-              <w:t>+0,021 (p ≈ 0,16)</w:t>
+              <w:t>+0,021 (p ≈ 0,18; Holm ≈ 0,72)</w:t>
             </w:r>
           </w:p>
         </w:tc>
@@ -4168,7 +4190,7 @@
               <w:rPr>
                 <w:sz w:val="21"/>
               </w:rPr>
-              <w:t>+0,001 (p ≈ 0,97)</w:t>
+              <w:t>+0,001 (p ≈ 0,96; Holm ≈ 1,00)</w:t>
             </w:r>
           </w:p>
         </w:tc>
@@ -4186,7 +4208,7 @@
               <w:rPr>
                 <w:sz w:val="21"/>
               </w:rPr>
-              <w:t>-5,8 điểm % (p ≈ 0,32)</w:t>
+              <w:t>-5,8 điểm % (p ≈ 0,33; Holm ≈ 0,98)</w:t>
             </w:r>
           </w:p>
         </w:tc>
@@ -4234,7 +4256,7 @@
               <w:rPr>
                 <w:sz w:val="21"/>
               </w:rPr>
-              <w:t>-0,015 (p ≈ 0,77)</w:t>
+              <w:t>-0,015 (p ≈ 0,74; Holm ≈ 1,00)</w:t>
             </w:r>
           </w:p>
         </w:tc>
@@ -4251,9 +4273,10 @@
             <w:r/>
             <w:r>
               <w:rPr>
+                <w:b/>
                 <w:sz w:val="21"/>
               </w:rPr>
-              <w:t>-0,327 (p &lt; 0,001)</w:t>
+              <w:t>-0,327 (p &lt; 0,001; Holm &lt; 0,001)</w:t>
             </w:r>
           </w:p>
         </w:tc>
@@ -4272,7 +4295,7 @@
               <w:rPr>
                 <w:sz w:val="21"/>
               </w:rPr>
-              <w:t>-17,1 điểm % (p ≈ 0,12)</w:t>
+              <w:t>-17,1 điểm % (p ≈ 0,12; Holm ≈ 0,58)</w:t>
             </w:r>
           </w:p>
         </w:tc>
@@ -4343,7 +4366,7 @@
         <w:t>Single-hop:</w:t>
       </w:r>
       <w:r>
-        <w:t xml:space="preserve"> khi thêm đoạn nhiễu, hallucination rate của RAG thuần tăng nhẹ (30,2% → 33,7%) còn của Self-RAG giảm (32,6% → 27,9%); Self-RAG có faithfulness cao hơn (0,920 so với 0,898). Xu hướng này đúng với vai trò lọc tài liệu của Self-RAG nhưng chưa có statistical significance (p ≈ 0,32, p ≈ 0,16); answer relevancy trung bình của hai hệ trùng nhau (0,776), không đủ bằng chứng để phân biệt (p ≈ 0,97). Thay đổi giữa top-k = 4 và top-k = 8 của từng hệ là hai lần chạy khác nhau, chỉ mô tả, không kiểm định.</w:t>
+        <w:t xml:space="preserve"> khi thêm đoạn nhiễu, hallucination rate của RAG thuần tăng nhẹ (30,2% → 33,7%) còn của Self-RAG giảm (32,6% → 27,9%); Self-RAG có faithfulness cao hơn (0,920 so với 0,898). Xu hướng này đúng với vai trò lọc tài liệu của Self-RAG nhưng chưa có statistical significance (p ≈ 0,33, p ≈ 0,18); answer relevancy trung bình của hai hệ trùng nhau (0,776), không đủ bằng chứng để phân biệt (p ≈ 0,96). Thay đổi giữa top-k = 4 và top-k = 8 của từng hệ là hai lần chạy khác nhau, chỉ mô tả, không kiểm định.</w:t>
       </w:r>
     </w:p>
     <w:p>
@@ -4357,7 +4380,7 @@
         <w:t>Multi-hop:</w:t>
       </w:r>
       <w:r>
-        <w:t xml:space="preserve"> top-8 giúp RAG thuần có đủ cả hai bài nguồn nhiều hơn (60% → 77% số câu), nên hallucination rate của RAG thuần giảm từ 71,4% xuống 57,1% và độ đúng tăng lên 91%. Self-RAG không được lợi tương tự: bước chấm độ liên quan vẫn loại mất một trong hai bài (tài liệu đưa vào sinh câu trả lời chỉ đủ hai nguồn ở 26% số câu) và hệ vẫn refuse 49% số câu. Chênh lệch hallucination rate còn 17,1 điểm % và không còn statistical significance (p ≈ 0,12); faithfulness của hai hệ không đủ bằng chứng để phân biệt (p ≈ 0,77); answer relevancy của Self-RAG vẫn thấp hơn rõ rệt (0,420 so với 0,747, p &lt; 0,001).</w:t>
+        <w:t xml:space="preserve"> top-8 giúp RAG thuần có đủ cả hai bài nguồn nhiều hơn (60% → 77% số câu), nên hallucination rate của RAG thuần giảm từ 71,4% xuống 57,1% và độ đúng tăng lên 91%. Self-RAG không được lợi tương tự: bước chấm độ liên quan vẫn loại mất một trong hai bài (tài liệu đưa vào sinh câu trả lời chỉ đủ hai nguồn ở 26% số câu) và hệ vẫn refuse 49% số câu. Chênh lệch hallucination rate còn 17,1 điểm % và không còn statistical significance (p ≈ 0,12); faithfulness của hai hệ không đủ bằng chứng để phân biệt (p ≈ 0,74); answer relevancy của Self-RAG vẫn thấp hơn rõ rệt (0,420 so với 0,747, p &lt; 0,001).</w:t>
       </w:r>
     </w:p>
     <w:p>
@@ -5136,6 +5159,1727 @@
     </w:p>
     <w:p>
       <w:pPr>
+        <w:pStyle w:val="Heading2"/>
+      </w:pPr>
+      <w:r>
+        <w:t>7.5. Tách hallucination khỏi refusal</w:t>
+      </w:r>
+    </w:p>
+    <w:p>
+      <w:pPr>
+        <w:ind w:firstLine="567"/>
+      </w:pPr>
+      <w:r>
+        <w:t>Hallucination rate ở các bảng trên tính trên mọi câu hỏi và câu refusal được tính là không hallucination, nên một hệ chỉ cần refuse nhiều hơn là hallucination rate đã giảm. Để tách hai hiệu ứng, mỗi câu có đáp án được xếp vào một trong bốn nhóm kết cục từ các nhãn đã có (refusal, độ đúng so với ground truth, hallucination): đúng và mọi claim có căn cứ; đúng nhưng có claim không được tài liệu hỗ trợ (thường là phần mô hình bổ sung bằng kiến thức có sẵn); sai; refuse oan. Câu out-of-corpus chỉ có hai kết cục (refuse đúng hoặc vẫn trả lời) và cả hai hệ đều refuse đúng toàn bộ (mục 7.2). Từ đó tính coverage (tỉ lệ câu có đáp án được trả lời), hallucination rate và độ đúng chỉ trên câu được trả lời.</w:t>
+      </w:r>
+    </w:p>
+    <w:p>
+      <w:pPr>
+        <w:pStyle w:val="Caption"/>
+        <w:keepNext/>
+        <w:jc w:val="center"/>
+      </w:pPr>
+      <w:r>
+        <w:t>Bảng 11. Nhóm kết cục của câu có đáp án (số câu) và các tỉ lệ tính trên câu được trả lời</w:t>
+      </w:r>
+    </w:p>
+    <w:tbl>
+      <w:tblPr>
+        <w:tblStyle w:val="TableGrid"/>
+        <w:tblW w:type="auto" w:w="0"/>
+        <w:jc w:val="center"/>
+        <w:tblLayout w:type="fixed"/>
+        <w:tblLook w:firstColumn="1" w:firstRow="1" w:lastColumn="0" w:lastRow="0" w:noHBand="0" w:noVBand="1" w:val="04A0"/>
+      </w:tblPr>
+      <w:tblGrid>
+        <w:gridCol w:w="1008"/>
+        <w:gridCol w:w="1008"/>
+        <w:gridCol w:w="1008"/>
+        <w:gridCol w:w="1008"/>
+        <w:gridCol w:w="1008"/>
+        <w:gridCol w:w="1008"/>
+        <w:gridCol w:w="1008"/>
+        <w:gridCol w:w="1008"/>
+        <w:gridCol w:w="1008"/>
+      </w:tblGrid>
+      <w:tr>
+        <w:trPr>
+          <w:tblHeader w:val="true"/>
+          <w:cantSplit w:val="true"/>
+        </w:trPr>
+        <w:tc>
+          <w:tcPr>
+            <w:tcW w:type="dxa" w:w="1191"/>
+            <w:shd w:val="clear" w:color="auto" w:fill="1C5CAB"/>
+          </w:tcPr>
+          <w:p>
+            <w:pPr>
+              <w:spacing w:after="20" w:line="264" w:lineRule="auto"/>
+              <w:jc w:val="center"/>
+            </w:pPr>
+            <w:r/>
+            <w:r>
+              <w:rPr>
+                <w:b/>
+                <w:color w:val="FFFFFF"/>
+                <w:sz w:val="19"/>
+              </w:rPr>
+              <w:t>Điều kiện</w:t>
+            </w:r>
+          </w:p>
+        </w:tc>
+        <w:tc>
+          <w:tcPr>
+            <w:tcW w:type="dxa" w:w="1247"/>
+            <w:shd w:val="clear" w:color="auto" w:fill="1C5CAB"/>
+          </w:tcPr>
+          <w:p>
+            <w:pPr>
+              <w:spacing w:after="20" w:line="264" w:lineRule="auto"/>
+              <w:jc w:val="center"/>
+            </w:pPr>
+            <w:r/>
+            <w:r>
+              <w:rPr>
+                <w:b/>
+                <w:color w:val="FFFFFF"/>
+                <w:sz w:val="19"/>
+              </w:rPr>
+              <w:t>Hệ thống</w:t>
+            </w:r>
+          </w:p>
+        </w:tc>
+        <w:tc>
+          <w:tcPr>
+            <w:tcW w:type="dxa" w:w="737"/>
+            <w:shd w:val="clear" w:color="auto" w:fill="1C5CAB"/>
+          </w:tcPr>
+          <w:p>
+            <w:pPr>
+              <w:spacing w:after="20" w:line="264" w:lineRule="auto"/>
+              <w:jc w:val="center"/>
+            </w:pPr>
+            <w:r/>
+            <w:r>
+              <w:rPr>
+                <w:b/>
+                <w:color w:val="FFFFFF"/>
+                <w:sz w:val="19"/>
+              </w:rPr>
+              <w:t>Đúng, có căn cứ</w:t>
+            </w:r>
+          </w:p>
+        </w:tc>
+        <w:tc>
+          <w:tcPr>
+            <w:tcW w:type="dxa" w:w="964"/>
+            <w:shd w:val="clear" w:color="auto" w:fill="1C5CAB"/>
+          </w:tcPr>
+          <w:p>
+            <w:pPr>
+              <w:spacing w:after="20" w:line="264" w:lineRule="auto"/>
+              <w:jc w:val="center"/>
+            </w:pPr>
+            <w:r/>
+            <w:r>
+              <w:rPr>
+                <w:b/>
+                <w:color w:val="FFFFFF"/>
+                <w:sz w:val="19"/>
+              </w:rPr>
+              <w:t>Đúng, có claim không được hỗ trợ</w:t>
+            </w:r>
+          </w:p>
+        </w:tc>
+        <w:tc>
+          <w:tcPr>
+            <w:tcW w:type="dxa" w:w="567"/>
+            <w:shd w:val="clear" w:color="auto" w:fill="1C5CAB"/>
+          </w:tcPr>
+          <w:p>
+            <w:pPr>
+              <w:spacing w:after="20" w:line="264" w:lineRule="auto"/>
+              <w:jc w:val="center"/>
+            </w:pPr>
+            <w:r/>
+            <w:r>
+              <w:rPr>
+                <w:b/>
+                <w:color w:val="FFFFFF"/>
+                <w:sz w:val="19"/>
+              </w:rPr>
+              <w:t>Sai</w:t>
+            </w:r>
+          </w:p>
+        </w:tc>
+        <w:tc>
+          <w:tcPr>
+            <w:tcW w:type="dxa" w:w="794"/>
+            <w:shd w:val="clear" w:color="auto" w:fill="1C5CAB"/>
+          </w:tcPr>
+          <w:p>
+            <w:pPr>
+              <w:spacing w:after="20" w:line="264" w:lineRule="auto"/>
+              <w:jc w:val="center"/>
+            </w:pPr>
+            <w:r/>
+            <w:r>
+              <w:rPr>
+                <w:b/>
+                <w:color w:val="FFFFFF"/>
+                <w:sz w:val="19"/>
+              </w:rPr>
+              <w:t>Refuse oan</w:t>
+            </w:r>
+          </w:p>
+        </w:tc>
+        <w:tc>
+          <w:tcPr>
+            <w:tcW w:type="dxa" w:w="1134"/>
+            <w:shd w:val="clear" w:color="auto" w:fill="1C5CAB"/>
+          </w:tcPr>
+          <w:p>
+            <w:pPr>
+              <w:spacing w:after="20" w:line="264" w:lineRule="auto"/>
+              <w:jc w:val="center"/>
+            </w:pPr>
+            <w:r/>
+            <w:r>
+              <w:rPr>
+                <w:b/>
+                <w:color w:val="FFFFFF"/>
+                <w:sz w:val="19"/>
+              </w:rPr>
+              <w:t>Coverage</w:t>
+            </w:r>
+          </w:p>
+        </w:tc>
+        <w:tc>
+          <w:tcPr>
+            <w:tcW w:type="dxa" w:w="1417"/>
+            <w:shd w:val="clear" w:color="auto" w:fill="1C5CAB"/>
+          </w:tcPr>
+          <w:p>
+            <w:pPr>
+              <w:spacing w:after="20" w:line="264" w:lineRule="auto"/>
+              <w:jc w:val="center"/>
+            </w:pPr>
+            <w:r/>
+            <w:r>
+              <w:rPr>
+                <w:b/>
+                <w:color w:val="FFFFFF"/>
+                <w:sz w:val="19"/>
+              </w:rPr>
+              <w:t>Hallucination (câu có trả lời)</w:t>
+            </w:r>
+          </w:p>
+        </w:tc>
+        <w:tc>
+          <w:tcPr>
+            <w:tcW w:type="dxa" w:w="1020"/>
+            <w:shd w:val="clear" w:color="auto" w:fill="1C5CAB"/>
+          </w:tcPr>
+          <w:p>
+            <w:pPr>
+              <w:spacing w:after="20" w:line="264" w:lineRule="auto"/>
+              <w:jc w:val="center"/>
+            </w:pPr>
+            <w:r/>
+            <w:r>
+              <w:rPr>
+                <w:b/>
+                <w:color w:val="FFFFFF"/>
+                <w:sz w:val="19"/>
+              </w:rPr>
+              <w:t>Độ đúng (câu có trả lời)</w:t>
+            </w:r>
+          </w:p>
+        </w:tc>
+      </w:tr>
+      <w:tr>
+        <w:trPr>
+          <w:cantSplit w:val="true"/>
+        </w:trPr>
+        <w:tc>
+          <w:tcPr>
+            <w:tcW w:type="dxa" w:w="1191"/>
+          </w:tcPr>
+          <w:p>
+            <w:pPr>
+              <w:spacing w:after="20" w:line="264" w:lineRule="auto"/>
+              <w:jc w:val="left"/>
+            </w:pPr>
+            <w:r>
+              <w:rPr>
+                <w:b/>
+              </w:rPr>
+            </w:r>
+            <w:r>
+              <w:rPr>
+                <w:b/>
+                <w:sz w:val="19"/>
+              </w:rPr>
+              <w:t>top-k = 4, single-hop</w:t>
+            </w:r>
+          </w:p>
+        </w:tc>
+        <w:tc>
+          <w:tcPr>
+            <w:tcW w:type="dxa" w:w="1247"/>
+          </w:tcPr>
+          <w:p>
+            <w:pPr>
+              <w:spacing w:after="20" w:line="264" w:lineRule="auto"/>
+              <w:jc w:val="left"/>
+            </w:pPr>
+            <w:r/>
+            <w:r>
+              <w:rPr>
+                <w:sz w:val="19"/>
+              </w:rPr>
+              <w:t>LangChain RAG</w:t>
+            </w:r>
+          </w:p>
+        </w:tc>
+        <w:tc>
+          <w:tcPr>
+            <w:tcW w:type="dxa" w:w="737"/>
+          </w:tcPr>
+          <w:p>
+            <w:pPr>
+              <w:spacing w:after="20" w:line="264" w:lineRule="auto"/>
+              <w:jc w:val="center"/>
+            </w:pPr>
+            <w:r/>
+            <w:r>
+              <w:rPr>
+                <w:sz w:val="19"/>
+              </w:rPr>
+              <w:t>49</w:t>
+            </w:r>
+          </w:p>
+        </w:tc>
+        <w:tc>
+          <w:tcPr>
+            <w:tcW w:type="dxa" w:w="964"/>
+          </w:tcPr>
+          <w:p>
+            <w:pPr>
+              <w:spacing w:after="20" w:line="264" w:lineRule="auto"/>
+              <w:jc w:val="center"/>
+            </w:pPr>
+            <w:r/>
+            <w:r>
+              <w:rPr>
+                <w:sz w:val="19"/>
+              </w:rPr>
+              <w:t>24</w:t>
+            </w:r>
+          </w:p>
+        </w:tc>
+        <w:tc>
+          <w:tcPr>
+            <w:tcW w:type="dxa" w:w="567"/>
+          </w:tcPr>
+          <w:p>
+            <w:pPr>
+              <w:spacing w:after="20" w:line="264" w:lineRule="auto"/>
+              <w:jc w:val="center"/>
+            </w:pPr>
+            <w:r/>
+            <w:r>
+              <w:rPr>
+                <w:sz w:val="19"/>
+              </w:rPr>
+              <w:t>6</w:t>
+            </w:r>
+          </w:p>
+        </w:tc>
+        <w:tc>
+          <w:tcPr>
+            <w:tcW w:type="dxa" w:w="794"/>
+          </w:tcPr>
+          <w:p>
+            <w:pPr>
+              <w:spacing w:after="20" w:line="264" w:lineRule="auto"/>
+              <w:jc w:val="center"/>
+            </w:pPr>
+            <w:r/>
+            <w:r>
+              <w:rPr>
+                <w:sz w:val="19"/>
+              </w:rPr>
+              <w:t>7</w:t>
+            </w:r>
+          </w:p>
+        </w:tc>
+        <w:tc>
+          <w:tcPr>
+            <w:tcW w:type="dxa" w:w="1134"/>
+          </w:tcPr>
+          <w:p>
+            <w:pPr>
+              <w:spacing w:after="20" w:line="264" w:lineRule="auto"/>
+              <w:jc w:val="center"/>
+            </w:pPr>
+            <w:r/>
+            <w:r>
+              <w:rPr>
+                <w:sz w:val="19"/>
+              </w:rPr>
+              <w:t>92%</w:t>
+            </w:r>
+          </w:p>
+        </w:tc>
+        <w:tc>
+          <w:tcPr>
+            <w:tcW w:type="dxa" w:w="1417"/>
+          </w:tcPr>
+          <w:p>
+            <w:pPr>
+              <w:spacing w:after="20" w:line="264" w:lineRule="auto"/>
+              <w:jc w:val="center"/>
+            </w:pPr>
+            <w:r/>
+            <w:r>
+              <w:rPr>
+                <w:sz w:val="19"/>
+              </w:rPr>
+              <w:t>33%</w:t>
+            </w:r>
+          </w:p>
+        </w:tc>
+        <w:tc>
+          <w:tcPr>
+            <w:tcW w:type="dxa" w:w="1020"/>
+          </w:tcPr>
+          <w:p>
+            <w:pPr>
+              <w:spacing w:after="20" w:line="264" w:lineRule="auto"/>
+              <w:jc w:val="center"/>
+            </w:pPr>
+            <w:r/>
+            <w:r>
+              <w:rPr>
+                <w:sz w:val="19"/>
+              </w:rPr>
+              <w:t>92%</w:t>
+            </w:r>
+          </w:p>
+        </w:tc>
+      </w:tr>
+      <w:tr>
+        <w:trPr>
+          <w:cantSplit w:val="true"/>
+        </w:trPr>
+        <w:tc>
+          <w:tcPr>
+            <w:tcW w:type="dxa" w:w="1191"/>
+            <w:shd w:val="clear" w:color="auto" w:fill="F0F5FC"/>
+          </w:tcPr>
+          <w:p>
+            <w:pPr>
+              <w:spacing w:after="20" w:line="264" w:lineRule="auto"/>
+              <w:jc w:val="left"/>
+            </w:pPr>
+            <w:r>
+              <w:rPr>
+                <w:b/>
+              </w:rPr>
+            </w:r>
+          </w:p>
+        </w:tc>
+        <w:tc>
+          <w:tcPr>
+            <w:tcW w:type="dxa" w:w="1247"/>
+            <w:shd w:val="clear" w:color="auto" w:fill="F0F5FC"/>
+          </w:tcPr>
+          <w:p>
+            <w:pPr>
+              <w:spacing w:after="20" w:line="264" w:lineRule="auto"/>
+              <w:jc w:val="left"/>
+            </w:pPr>
+            <w:r/>
+            <w:r>
+              <w:rPr>
+                <w:sz w:val="19"/>
+              </w:rPr>
+              <w:t>LangGraph Self-RAG</w:t>
+            </w:r>
+          </w:p>
+        </w:tc>
+        <w:tc>
+          <w:tcPr>
+            <w:tcW w:type="dxa" w:w="737"/>
+            <w:shd w:val="clear" w:color="auto" w:fill="F0F5FC"/>
+          </w:tcPr>
+          <w:p>
+            <w:pPr>
+              <w:spacing w:after="20" w:line="264" w:lineRule="auto"/>
+              <w:jc w:val="center"/>
+            </w:pPr>
+            <w:r/>
+            <w:r>
+              <w:rPr>
+                <w:sz w:val="19"/>
+              </w:rPr>
+              <w:t>51</w:t>
+            </w:r>
+          </w:p>
+        </w:tc>
+        <w:tc>
+          <w:tcPr>
+            <w:tcW w:type="dxa" w:w="964"/>
+            <w:shd w:val="clear" w:color="auto" w:fill="F0F5FC"/>
+          </w:tcPr>
+          <w:p>
+            <w:pPr>
+              <w:spacing w:after="20" w:line="264" w:lineRule="auto"/>
+              <w:jc w:val="center"/>
+            </w:pPr>
+            <w:r/>
+            <w:r>
+              <w:rPr>
+                <w:sz w:val="19"/>
+              </w:rPr>
+              <w:t>25</w:t>
+            </w:r>
+          </w:p>
+        </w:tc>
+        <w:tc>
+          <w:tcPr>
+            <w:tcW w:type="dxa" w:w="567"/>
+            <w:shd w:val="clear" w:color="auto" w:fill="F0F5FC"/>
+          </w:tcPr>
+          <w:p>
+            <w:pPr>
+              <w:spacing w:after="20" w:line="264" w:lineRule="auto"/>
+              <w:jc w:val="center"/>
+            </w:pPr>
+            <w:r/>
+            <w:r>
+              <w:rPr>
+                <w:sz w:val="19"/>
+              </w:rPr>
+              <w:t>4</w:t>
+            </w:r>
+          </w:p>
+        </w:tc>
+        <w:tc>
+          <w:tcPr>
+            <w:tcW w:type="dxa" w:w="794"/>
+            <w:shd w:val="clear" w:color="auto" w:fill="F0F5FC"/>
+          </w:tcPr>
+          <w:p>
+            <w:pPr>
+              <w:spacing w:after="20" w:line="264" w:lineRule="auto"/>
+              <w:jc w:val="center"/>
+            </w:pPr>
+            <w:r/>
+            <w:r>
+              <w:rPr>
+                <w:sz w:val="19"/>
+              </w:rPr>
+              <w:t>6</w:t>
+            </w:r>
+          </w:p>
+        </w:tc>
+        <w:tc>
+          <w:tcPr>
+            <w:tcW w:type="dxa" w:w="1134"/>
+            <w:shd w:val="clear" w:color="auto" w:fill="F0F5FC"/>
+          </w:tcPr>
+          <w:p>
+            <w:pPr>
+              <w:spacing w:after="20" w:line="264" w:lineRule="auto"/>
+              <w:jc w:val="center"/>
+            </w:pPr>
+            <w:r/>
+            <w:r>
+              <w:rPr>
+                <w:sz w:val="19"/>
+              </w:rPr>
+              <w:t>93%</w:t>
+            </w:r>
+          </w:p>
+        </w:tc>
+        <w:tc>
+          <w:tcPr>
+            <w:tcW w:type="dxa" w:w="1417"/>
+            <w:shd w:val="clear" w:color="auto" w:fill="F0F5FC"/>
+          </w:tcPr>
+          <w:p>
+            <w:pPr>
+              <w:spacing w:after="20" w:line="264" w:lineRule="auto"/>
+              <w:jc w:val="center"/>
+            </w:pPr>
+            <w:r/>
+            <w:r>
+              <w:rPr>
+                <w:sz w:val="19"/>
+              </w:rPr>
+              <w:t>35%</w:t>
+            </w:r>
+          </w:p>
+        </w:tc>
+        <w:tc>
+          <w:tcPr>
+            <w:tcW w:type="dxa" w:w="1020"/>
+            <w:shd w:val="clear" w:color="auto" w:fill="F0F5FC"/>
+          </w:tcPr>
+          <w:p>
+            <w:pPr>
+              <w:spacing w:after="20" w:line="264" w:lineRule="auto"/>
+              <w:jc w:val="center"/>
+            </w:pPr>
+            <w:r/>
+            <w:r>
+              <w:rPr>
+                <w:sz w:val="19"/>
+              </w:rPr>
+              <w:t>95%</w:t>
+            </w:r>
+          </w:p>
+        </w:tc>
+      </w:tr>
+      <w:tr>
+        <w:trPr>
+          <w:cantSplit w:val="true"/>
+        </w:trPr>
+        <w:tc>
+          <w:tcPr>
+            <w:tcW w:type="dxa" w:w="1191"/>
+          </w:tcPr>
+          <w:p>
+            <w:pPr>
+              <w:spacing w:after="20" w:line="264" w:lineRule="auto"/>
+              <w:jc w:val="left"/>
+            </w:pPr>
+            <w:r>
+              <w:rPr>
+                <w:b/>
+              </w:rPr>
+            </w:r>
+            <w:r>
+              <w:rPr>
+                <w:b/>
+                <w:sz w:val="19"/>
+              </w:rPr>
+              <w:t>top-k = 4, multi-hop</w:t>
+            </w:r>
+          </w:p>
+        </w:tc>
+        <w:tc>
+          <w:tcPr>
+            <w:tcW w:type="dxa" w:w="1247"/>
+          </w:tcPr>
+          <w:p>
+            <w:pPr>
+              <w:spacing w:after="20" w:line="264" w:lineRule="auto"/>
+              <w:jc w:val="left"/>
+            </w:pPr>
+            <w:r/>
+            <w:r>
+              <w:rPr>
+                <w:sz w:val="19"/>
+              </w:rPr>
+              <w:t>LangChain RAG</w:t>
+            </w:r>
+          </w:p>
+        </w:tc>
+        <w:tc>
+          <w:tcPr>
+            <w:tcW w:type="dxa" w:w="737"/>
+          </w:tcPr>
+          <w:p>
+            <w:pPr>
+              <w:spacing w:after="20" w:line="264" w:lineRule="auto"/>
+              <w:jc w:val="center"/>
+            </w:pPr>
+            <w:r/>
+            <w:r>
+              <w:rPr>
+                <w:sz w:val="19"/>
+              </w:rPr>
+              <w:t>5</w:t>
+            </w:r>
+          </w:p>
+        </w:tc>
+        <w:tc>
+          <w:tcPr>
+            <w:tcW w:type="dxa" w:w="964"/>
+          </w:tcPr>
+          <w:p>
+            <w:pPr>
+              <w:spacing w:after="20" w:line="264" w:lineRule="auto"/>
+              <w:jc w:val="center"/>
+            </w:pPr>
+            <w:r/>
+            <w:r>
+              <w:rPr>
+                <w:sz w:val="19"/>
+              </w:rPr>
+              <w:t>24</w:t>
+            </w:r>
+          </w:p>
+        </w:tc>
+        <w:tc>
+          <w:tcPr>
+            <w:tcW w:type="dxa" w:w="567"/>
+          </w:tcPr>
+          <w:p>
+            <w:pPr>
+              <w:spacing w:after="20" w:line="264" w:lineRule="auto"/>
+              <w:jc w:val="center"/>
+            </w:pPr>
+            <w:r/>
+            <w:r>
+              <w:rPr>
+                <w:sz w:val="19"/>
+              </w:rPr>
+              <w:t>1</w:t>
+            </w:r>
+          </w:p>
+        </w:tc>
+        <w:tc>
+          <w:tcPr>
+            <w:tcW w:type="dxa" w:w="794"/>
+          </w:tcPr>
+          <w:p>
+            <w:pPr>
+              <w:spacing w:after="20" w:line="264" w:lineRule="auto"/>
+              <w:jc w:val="center"/>
+            </w:pPr>
+            <w:r/>
+            <w:r>
+              <w:rPr>
+                <w:sz w:val="19"/>
+              </w:rPr>
+              <w:t>5</w:t>
+            </w:r>
+          </w:p>
+        </w:tc>
+        <w:tc>
+          <w:tcPr>
+            <w:tcW w:type="dxa" w:w="1134"/>
+          </w:tcPr>
+          <w:p>
+            <w:pPr>
+              <w:spacing w:after="20" w:line="264" w:lineRule="auto"/>
+              <w:jc w:val="center"/>
+            </w:pPr>
+            <w:r/>
+            <w:r>
+              <w:rPr>
+                <w:sz w:val="19"/>
+              </w:rPr>
+              <w:t>86%</w:t>
+            </w:r>
+          </w:p>
+        </w:tc>
+        <w:tc>
+          <w:tcPr>
+            <w:tcW w:type="dxa" w:w="1417"/>
+          </w:tcPr>
+          <w:p>
+            <w:pPr>
+              <w:spacing w:after="20" w:line="264" w:lineRule="auto"/>
+              <w:jc w:val="center"/>
+            </w:pPr>
+            <w:r/>
+            <w:r>
+              <w:rPr>
+                <w:sz w:val="19"/>
+              </w:rPr>
+              <w:t>83%</w:t>
+            </w:r>
+          </w:p>
+        </w:tc>
+        <w:tc>
+          <w:tcPr>
+            <w:tcW w:type="dxa" w:w="1020"/>
+          </w:tcPr>
+          <w:p>
+            <w:pPr>
+              <w:spacing w:after="20" w:line="264" w:lineRule="auto"/>
+              <w:jc w:val="center"/>
+            </w:pPr>
+            <w:r/>
+            <w:r>
+              <w:rPr>
+                <w:sz w:val="19"/>
+              </w:rPr>
+              <w:t>97%</w:t>
+            </w:r>
+          </w:p>
+        </w:tc>
+      </w:tr>
+      <w:tr>
+        <w:trPr>
+          <w:cantSplit w:val="true"/>
+        </w:trPr>
+        <w:tc>
+          <w:tcPr>
+            <w:tcW w:type="dxa" w:w="1191"/>
+            <w:shd w:val="clear" w:color="auto" w:fill="F0F5FC"/>
+          </w:tcPr>
+          <w:p>
+            <w:pPr>
+              <w:spacing w:after="20" w:line="264" w:lineRule="auto"/>
+              <w:jc w:val="left"/>
+            </w:pPr>
+            <w:r>
+              <w:rPr>
+                <w:b/>
+              </w:rPr>
+            </w:r>
+          </w:p>
+        </w:tc>
+        <w:tc>
+          <w:tcPr>
+            <w:tcW w:type="dxa" w:w="1247"/>
+            <w:shd w:val="clear" w:color="auto" w:fill="F0F5FC"/>
+          </w:tcPr>
+          <w:p>
+            <w:pPr>
+              <w:spacing w:after="20" w:line="264" w:lineRule="auto"/>
+              <w:jc w:val="left"/>
+            </w:pPr>
+            <w:r/>
+            <w:r>
+              <w:rPr>
+                <w:sz w:val="19"/>
+              </w:rPr>
+              <w:t>LangGraph Self-RAG</w:t>
+            </w:r>
+          </w:p>
+        </w:tc>
+        <w:tc>
+          <w:tcPr>
+            <w:tcW w:type="dxa" w:w="737"/>
+            <w:shd w:val="clear" w:color="auto" w:fill="F0F5FC"/>
+          </w:tcPr>
+          <w:p>
+            <w:pPr>
+              <w:spacing w:after="20" w:line="264" w:lineRule="auto"/>
+              <w:jc w:val="center"/>
+            </w:pPr>
+            <w:r/>
+            <w:r>
+              <w:rPr>
+                <w:sz w:val="19"/>
+              </w:rPr>
+              <w:t>5</w:t>
+            </w:r>
+          </w:p>
+        </w:tc>
+        <w:tc>
+          <w:tcPr>
+            <w:tcW w:type="dxa" w:w="964"/>
+            <w:shd w:val="clear" w:color="auto" w:fill="F0F5FC"/>
+          </w:tcPr>
+          <w:p>
+            <w:pPr>
+              <w:spacing w:after="20" w:line="264" w:lineRule="auto"/>
+              <w:jc w:val="center"/>
+            </w:pPr>
+            <w:r/>
+            <w:r>
+              <w:rPr>
+                <w:sz w:val="19"/>
+              </w:rPr>
+              <w:t>12</w:t>
+            </w:r>
+          </w:p>
+        </w:tc>
+        <w:tc>
+          <w:tcPr>
+            <w:tcW w:type="dxa" w:w="567"/>
+            <w:shd w:val="clear" w:color="auto" w:fill="F0F5FC"/>
+          </w:tcPr>
+          <w:p>
+            <w:pPr>
+              <w:spacing w:after="20" w:line="264" w:lineRule="auto"/>
+              <w:jc w:val="center"/>
+            </w:pPr>
+            <w:r/>
+            <w:r>
+              <w:rPr>
+                <w:sz w:val="19"/>
+              </w:rPr>
+              <w:t>1</w:t>
+            </w:r>
+          </w:p>
+        </w:tc>
+        <w:tc>
+          <w:tcPr>
+            <w:tcW w:type="dxa" w:w="794"/>
+            <w:shd w:val="clear" w:color="auto" w:fill="F0F5FC"/>
+          </w:tcPr>
+          <w:p>
+            <w:pPr>
+              <w:spacing w:after="20" w:line="264" w:lineRule="auto"/>
+              <w:jc w:val="center"/>
+            </w:pPr>
+            <w:r/>
+            <w:r>
+              <w:rPr>
+                <w:sz w:val="19"/>
+              </w:rPr>
+              <w:t>17</w:t>
+            </w:r>
+          </w:p>
+        </w:tc>
+        <w:tc>
+          <w:tcPr>
+            <w:tcW w:type="dxa" w:w="1134"/>
+            <w:shd w:val="clear" w:color="auto" w:fill="F0F5FC"/>
+          </w:tcPr>
+          <w:p>
+            <w:pPr>
+              <w:spacing w:after="20" w:line="264" w:lineRule="auto"/>
+              <w:jc w:val="center"/>
+            </w:pPr>
+            <w:r/>
+            <w:r>
+              <w:rPr>
+                <w:sz w:val="19"/>
+              </w:rPr>
+              <w:t>51%</w:t>
+            </w:r>
+          </w:p>
+        </w:tc>
+        <w:tc>
+          <w:tcPr>
+            <w:tcW w:type="dxa" w:w="1417"/>
+            <w:shd w:val="clear" w:color="auto" w:fill="F0F5FC"/>
+          </w:tcPr>
+          <w:p>
+            <w:pPr>
+              <w:spacing w:after="20" w:line="264" w:lineRule="auto"/>
+              <w:jc w:val="center"/>
+            </w:pPr>
+            <w:r/>
+            <w:r>
+              <w:rPr>
+                <w:sz w:val="19"/>
+              </w:rPr>
+              <w:t>72%</w:t>
+            </w:r>
+          </w:p>
+        </w:tc>
+        <w:tc>
+          <w:tcPr>
+            <w:tcW w:type="dxa" w:w="1020"/>
+            <w:shd w:val="clear" w:color="auto" w:fill="F0F5FC"/>
+          </w:tcPr>
+          <w:p>
+            <w:pPr>
+              <w:spacing w:after="20" w:line="264" w:lineRule="auto"/>
+              <w:jc w:val="center"/>
+            </w:pPr>
+            <w:r/>
+            <w:r>
+              <w:rPr>
+                <w:sz w:val="19"/>
+              </w:rPr>
+              <w:t>94%</w:t>
+            </w:r>
+          </w:p>
+        </w:tc>
+      </w:tr>
+      <w:tr>
+        <w:trPr>
+          <w:cantSplit w:val="true"/>
+        </w:trPr>
+        <w:tc>
+          <w:tcPr>
+            <w:tcW w:type="dxa" w:w="1191"/>
+          </w:tcPr>
+          <w:p>
+            <w:pPr>
+              <w:spacing w:after="20" w:line="264" w:lineRule="auto"/>
+              <w:jc w:val="left"/>
+            </w:pPr>
+            <w:r>
+              <w:rPr>
+                <w:b/>
+              </w:rPr>
+            </w:r>
+            <w:r>
+              <w:rPr>
+                <w:b/>
+                <w:sz w:val="19"/>
+              </w:rPr>
+              <w:t>top-k = 8, single-hop</w:t>
+            </w:r>
+          </w:p>
+        </w:tc>
+        <w:tc>
+          <w:tcPr>
+            <w:tcW w:type="dxa" w:w="1247"/>
+          </w:tcPr>
+          <w:p>
+            <w:pPr>
+              <w:spacing w:after="20" w:line="264" w:lineRule="auto"/>
+              <w:jc w:val="left"/>
+            </w:pPr>
+            <w:r/>
+            <w:r>
+              <w:rPr>
+                <w:sz w:val="19"/>
+              </w:rPr>
+              <w:t>LangChain RAG</w:t>
+            </w:r>
+          </w:p>
+        </w:tc>
+        <w:tc>
+          <w:tcPr>
+            <w:tcW w:type="dxa" w:w="737"/>
+          </w:tcPr>
+          <w:p>
+            <w:pPr>
+              <w:spacing w:after="20" w:line="264" w:lineRule="auto"/>
+              <w:jc w:val="center"/>
+            </w:pPr>
+            <w:r/>
+            <w:r>
+              <w:rPr>
+                <w:sz w:val="19"/>
+              </w:rPr>
+              <w:t>49</w:t>
+            </w:r>
+          </w:p>
+        </w:tc>
+        <w:tc>
+          <w:tcPr>
+            <w:tcW w:type="dxa" w:w="964"/>
+          </w:tcPr>
+          <w:p>
+            <w:pPr>
+              <w:spacing w:after="20" w:line="264" w:lineRule="auto"/>
+              <w:jc w:val="center"/>
+            </w:pPr>
+            <w:r/>
+            <w:r>
+              <w:rPr>
+                <w:sz w:val="19"/>
+              </w:rPr>
+              <w:t>29</w:t>
+            </w:r>
+          </w:p>
+        </w:tc>
+        <w:tc>
+          <w:tcPr>
+            <w:tcW w:type="dxa" w:w="567"/>
+          </w:tcPr>
+          <w:p>
+            <w:pPr>
+              <w:spacing w:after="20" w:line="264" w:lineRule="auto"/>
+              <w:jc w:val="center"/>
+            </w:pPr>
+            <w:r/>
+            <w:r>
+              <w:rPr>
+                <w:sz w:val="19"/>
+              </w:rPr>
+              <w:t>3</w:t>
+            </w:r>
+          </w:p>
+        </w:tc>
+        <w:tc>
+          <w:tcPr>
+            <w:tcW w:type="dxa" w:w="794"/>
+          </w:tcPr>
+          <w:p>
+            <w:pPr>
+              <w:spacing w:after="20" w:line="264" w:lineRule="auto"/>
+              <w:jc w:val="center"/>
+            </w:pPr>
+            <w:r/>
+            <w:r>
+              <w:rPr>
+                <w:sz w:val="19"/>
+              </w:rPr>
+              <w:t>5</w:t>
+            </w:r>
+          </w:p>
+        </w:tc>
+        <w:tc>
+          <w:tcPr>
+            <w:tcW w:type="dxa" w:w="1134"/>
+          </w:tcPr>
+          <w:p>
+            <w:pPr>
+              <w:spacing w:after="20" w:line="264" w:lineRule="auto"/>
+              <w:jc w:val="center"/>
+            </w:pPr>
+            <w:r/>
+            <w:r>
+              <w:rPr>
+                <w:sz w:val="19"/>
+              </w:rPr>
+              <w:t>94%</w:t>
+            </w:r>
+          </w:p>
+        </w:tc>
+        <w:tc>
+          <w:tcPr>
+            <w:tcW w:type="dxa" w:w="1417"/>
+          </w:tcPr>
+          <w:p>
+            <w:pPr>
+              <w:spacing w:after="20" w:line="264" w:lineRule="auto"/>
+              <w:jc w:val="center"/>
+            </w:pPr>
+            <w:r/>
+            <w:r>
+              <w:rPr>
+                <w:sz w:val="19"/>
+              </w:rPr>
+              <w:t>36%</w:t>
+            </w:r>
+          </w:p>
+        </w:tc>
+        <w:tc>
+          <w:tcPr>
+            <w:tcW w:type="dxa" w:w="1020"/>
+          </w:tcPr>
+          <w:p>
+            <w:pPr>
+              <w:spacing w:after="20" w:line="264" w:lineRule="auto"/>
+              <w:jc w:val="center"/>
+            </w:pPr>
+            <w:r/>
+            <w:r>
+              <w:rPr>
+                <w:sz w:val="19"/>
+              </w:rPr>
+              <w:t>96%</w:t>
+            </w:r>
+          </w:p>
+        </w:tc>
+      </w:tr>
+      <w:tr>
+        <w:trPr>
+          <w:cantSplit w:val="true"/>
+        </w:trPr>
+        <w:tc>
+          <w:tcPr>
+            <w:tcW w:type="dxa" w:w="1191"/>
+            <w:shd w:val="clear" w:color="auto" w:fill="F0F5FC"/>
+          </w:tcPr>
+          <w:p>
+            <w:pPr>
+              <w:spacing w:after="20" w:line="264" w:lineRule="auto"/>
+              <w:jc w:val="left"/>
+            </w:pPr>
+            <w:r>
+              <w:rPr>
+                <w:b/>
+              </w:rPr>
+            </w:r>
+          </w:p>
+        </w:tc>
+        <w:tc>
+          <w:tcPr>
+            <w:tcW w:type="dxa" w:w="1247"/>
+            <w:shd w:val="clear" w:color="auto" w:fill="F0F5FC"/>
+          </w:tcPr>
+          <w:p>
+            <w:pPr>
+              <w:spacing w:after="20" w:line="264" w:lineRule="auto"/>
+              <w:jc w:val="left"/>
+            </w:pPr>
+            <w:r/>
+            <w:r>
+              <w:rPr>
+                <w:sz w:val="19"/>
+              </w:rPr>
+              <w:t>LangGraph Self-RAG</w:t>
+            </w:r>
+          </w:p>
+        </w:tc>
+        <w:tc>
+          <w:tcPr>
+            <w:tcW w:type="dxa" w:w="737"/>
+            <w:shd w:val="clear" w:color="auto" w:fill="F0F5FC"/>
+          </w:tcPr>
+          <w:p>
+            <w:pPr>
+              <w:spacing w:after="20" w:line="264" w:lineRule="auto"/>
+              <w:jc w:val="center"/>
+            </w:pPr>
+            <w:r/>
+            <w:r>
+              <w:rPr>
+                <w:sz w:val="19"/>
+              </w:rPr>
+              <w:t>56</w:t>
+            </w:r>
+          </w:p>
+        </w:tc>
+        <w:tc>
+          <w:tcPr>
+            <w:tcW w:type="dxa" w:w="964"/>
+            <w:shd w:val="clear" w:color="auto" w:fill="F0F5FC"/>
+          </w:tcPr>
+          <w:p>
+            <w:pPr>
+              <w:spacing w:after="20" w:line="264" w:lineRule="auto"/>
+              <w:jc w:val="center"/>
+            </w:pPr>
+            <w:r/>
+            <w:r>
+              <w:rPr>
+                <w:sz w:val="19"/>
+              </w:rPr>
+              <w:t>21</w:t>
+            </w:r>
+          </w:p>
+        </w:tc>
+        <w:tc>
+          <w:tcPr>
+            <w:tcW w:type="dxa" w:w="567"/>
+            <w:shd w:val="clear" w:color="auto" w:fill="F0F5FC"/>
+          </w:tcPr>
+          <w:p>
+            <w:pPr>
+              <w:spacing w:after="20" w:line="264" w:lineRule="auto"/>
+              <w:jc w:val="center"/>
+            </w:pPr>
+            <w:r/>
+            <w:r>
+              <w:rPr>
+                <w:sz w:val="19"/>
+              </w:rPr>
+              <w:t>4</w:t>
+            </w:r>
+          </w:p>
+        </w:tc>
+        <w:tc>
+          <w:tcPr>
+            <w:tcW w:type="dxa" w:w="794"/>
+            <w:shd w:val="clear" w:color="auto" w:fill="F0F5FC"/>
+          </w:tcPr>
+          <w:p>
+            <w:pPr>
+              <w:spacing w:after="20" w:line="264" w:lineRule="auto"/>
+              <w:jc w:val="center"/>
+            </w:pPr>
+            <w:r/>
+            <w:r>
+              <w:rPr>
+                <w:sz w:val="19"/>
+              </w:rPr>
+              <w:t>5</w:t>
+            </w:r>
+          </w:p>
+        </w:tc>
+        <w:tc>
+          <w:tcPr>
+            <w:tcW w:type="dxa" w:w="1134"/>
+            <w:shd w:val="clear" w:color="auto" w:fill="F0F5FC"/>
+          </w:tcPr>
+          <w:p>
+            <w:pPr>
+              <w:spacing w:after="20" w:line="264" w:lineRule="auto"/>
+              <w:jc w:val="center"/>
+            </w:pPr>
+            <w:r/>
+            <w:r>
+              <w:rPr>
+                <w:sz w:val="19"/>
+              </w:rPr>
+              <w:t>94%</w:t>
+            </w:r>
+          </w:p>
+        </w:tc>
+        <w:tc>
+          <w:tcPr>
+            <w:tcW w:type="dxa" w:w="1417"/>
+            <w:shd w:val="clear" w:color="auto" w:fill="F0F5FC"/>
+          </w:tcPr>
+          <w:p>
+            <w:pPr>
+              <w:spacing w:after="20" w:line="264" w:lineRule="auto"/>
+              <w:jc w:val="center"/>
+            </w:pPr>
+            <w:r/>
+            <w:r>
+              <w:rPr>
+                <w:sz w:val="19"/>
+              </w:rPr>
+              <w:t>30%</w:t>
+            </w:r>
+          </w:p>
+        </w:tc>
+        <w:tc>
+          <w:tcPr>
+            <w:tcW w:type="dxa" w:w="1020"/>
+            <w:shd w:val="clear" w:color="auto" w:fill="F0F5FC"/>
+          </w:tcPr>
+          <w:p>
+            <w:pPr>
+              <w:spacing w:after="20" w:line="264" w:lineRule="auto"/>
+              <w:jc w:val="center"/>
+            </w:pPr>
+            <w:r/>
+            <w:r>
+              <w:rPr>
+                <w:sz w:val="19"/>
+              </w:rPr>
+              <w:t>95%</w:t>
+            </w:r>
+          </w:p>
+        </w:tc>
+      </w:tr>
+      <w:tr>
+        <w:trPr>
+          <w:cantSplit w:val="true"/>
+        </w:trPr>
+        <w:tc>
+          <w:tcPr>
+            <w:tcW w:type="dxa" w:w="1191"/>
+          </w:tcPr>
+          <w:p>
+            <w:pPr>
+              <w:spacing w:after="20" w:line="264" w:lineRule="auto"/>
+              <w:jc w:val="left"/>
+            </w:pPr>
+            <w:r>
+              <w:rPr>
+                <w:b/>
+              </w:rPr>
+            </w:r>
+            <w:r>
+              <w:rPr>
+                <w:b/>
+                <w:sz w:val="19"/>
+              </w:rPr>
+              <w:t>top-k = 8, multi-hop</w:t>
+            </w:r>
+          </w:p>
+        </w:tc>
+        <w:tc>
+          <w:tcPr>
+            <w:tcW w:type="dxa" w:w="1247"/>
+          </w:tcPr>
+          <w:p>
+            <w:pPr>
+              <w:spacing w:after="20" w:line="264" w:lineRule="auto"/>
+              <w:jc w:val="left"/>
+            </w:pPr>
+            <w:r/>
+            <w:r>
+              <w:rPr>
+                <w:sz w:val="19"/>
+              </w:rPr>
+              <w:t>LangChain RAG</w:t>
+            </w:r>
+          </w:p>
+        </w:tc>
+        <w:tc>
+          <w:tcPr>
+            <w:tcW w:type="dxa" w:w="737"/>
+          </w:tcPr>
+          <w:p>
+            <w:pPr>
+              <w:spacing w:after="20" w:line="264" w:lineRule="auto"/>
+              <w:jc w:val="center"/>
+            </w:pPr>
+            <w:r/>
+            <w:r>
+              <w:rPr>
+                <w:sz w:val="19"/>
+              </w:rPr>
+              <w:t>12</w:t>
+            </w:r>
+          </w:p>
+        </w:tc>
+        <w:tc>
+          <w:tcPr>
+            <w:tcW w:type="dxa" w:w="964"/>
+          </w:tcPr>
+          <w:p>
+            <w:pPr>
+              <w:spacing w:after="20" w:line="264" w:lineRule="auto"/>
+              <w:jc w:val="center"/>
+            </w:pPr>
+            <w:r/>
+            <w:r>
+              <w:rPr>
+                <w:sz w:val="19"/>
+              </w:rPr>
+              <w:t>20</w:t>
+            </w:r>
+          </w:p>
+        </w:tc>
+        <w:tc>
+          <w:tcPr>
+            <w:tcW w:type="dxa" w:w="567"/>
+          </w:tcPr>
+          <w:p>
+            <w:pPr>
+              <w:spacing w:after="20" w:line="264" w:lineRule="auto"/>
+              <w:jc w:val="center"/>
+            </w:pPr>
+            <w:r/>
+            <w:r>
+              <w:rPr>
+                <w:sz w:val="19"/>
+              </w:rPr>
+              <w:t>0</w:t>
+            </w:r>
+          </w:p>
+        </w:tc>
+        <w:tc>
+          <w:tcPr>
+            <w:tcW w:type="dxa" w:w="794"/>
+          </w:tcPr>
+          <w:p>
+            <w:pPr>
+              <w:spacing w:after="20" w:line="264" w:lineRule="auto"/>
+              <w:jc w:val="center"/>
+            </w:pPr>
+            <w:r/>
+            <w:r>
+              <w:rPr>
+                <w:sz w:val="19"/>
+              </w:rPr>
+              <w:t>3</w:t>
+            </w:r>
+          </w:p>
+        </w:tc>
+        <w:tc>
+          <w:tcPr>
+            <w:tcW w:type="dxa" w:w="1134"/>
+          </w:tcPr>
+          <w:p>
+            <w:pPr>
+              <w:spacing w:after="20" w:line="264" w:lineRule="auto"/>
+              <w:jc w:val="center"/>
+            </w:pPr>
+            <w:r/>
+            <w:r>
+              <w:rPr>
+                <w:sz w:val="19"/>
+              </w:rPr>
+              <w:t>91%</w:t>
+            </w:r>
+          </w:p>
+        </w:tc>
+        <w:tc>
+          <w:tcPr>
+            <w:tcW w:type="dxa" w:w="1417"/>
+          </w:tcPr>
+          <w:p>
+            <w:pPr>
+              <w:spacing w:after="20" w:line="264" w:lineRule="auto"/>
+              <w:jc w:val="center"/>
+            </w:pPr>
+            <w:r/>
+            <w:r>
+              <w:rPr>
+                <w:sz w:val="19"/>
+              </w:rPr>
+              <w:t>62%</w:t>
+            </w:r>
+          </w:p>
+        </w:tc>
+        <w:tc>
+          <w:tcPr>
+            <w:tcW w:type="dxa" w:w="1020"/>
+          </w:tcPr>
+          <w:p>
+            <w:pPr>
+              <w:spacing w:after="20" w:line="264" w:lineRule="auto"/>
+              <w:jc w:val="center"/>
+            </w:pPr>
+            <w:r/>
+            <w:r>
+              <w:rPr>
+                <w:sz w:val="19"/>
+              </w:rPr>
+              <w:t>100%</w:t>
+            </w:r>
+          </w:p>
+        </w:tc>
+      </w:tr>
+      <w:tr>
+        <w:trPr>
+          <w:cantSplit w:val="true"/>
+        </w:trPr>
+        <w:tc>
+          <w:tcPr>
+            <w:tcW w:type="dxa" w:w="1191"/>
+            <w:shd w:val="clear" w:color="auto" w:fill="F0F5FC"/>
+          </w:tcPr>
+          <w:p>
+            <w:pPr>
+              <w:spacing w:after="20" w:line="264" w:lineRule="auto"/>
+              <w:jc w:val="left"/>
+            </w:pPr>
+            <w:r>
+              <w:rPr>
+                <w:b/>
+              </w:rPr>
+            </w:r>
+          </w:p>
+        </w:tc>
+        <w:tc>
+          <w:tcPr>
+            <w:tcW w:type="dxa" w:w="1247"/>
+            <w:shd w:val="clear" w:color="auto" w:fill="F0F5FC"/>
+          </w:tcPr>
+          <w:p>
+            <w:pPr>
+              <w:spacing w:after="20" w:line="264" w:lineRule="auto"/>
+              <w:jc w:val="left"/>
+            </w:pPr>
+            <w:r/>
+            <w:r>
+              <w:rPr>
+                <w:sz w:val="19"/>
+              </w:rPr>
+              <w:t>LangGraph Self-RAG</w:t>
+            </w:r>
+          </w:p>
+        </w:tc>
+        <w:tc>
+          <w:tcPr>
+            <w:tcW w:type="dxa" w:w="737"/>
+            <w:shd w:val="clear" w:color="auto" w:fill="F0F5FC"/>
+          </w:tcPr>
+          <w:p>
+            <w:pPr>
+              <w:spacing w:after="20" w:line="264" w:lineRule="auto"/>
+              <w:jc w:val="center"/>
+            </w:pPr>
+            <w:r/>
+            <w:r>
+              <w:rPr>
+                <w:sz w:val="19"/>
+              </w:rPr>
+              <w:t>4</w:t>
+            </w:r>
+          </w:p>
+        </w:tc>
+        <w:tc>
+          <w:tcPr>
+            <w:tcW w:type="dxa" w:w="964"/>
+            <w:shd w:val="clear" w:color="auto" w:fill="F0F5FC"/>
+          </w:tcPr>
+          <w:p>
+            <w:pPr>
+              <w:spacing w:after="20" w:line="264" w:lineRule="auto"/>
+              <w:jc w:val="center"/>
+            </w:pPr>
+            <w:r/>
+            <w:r>
+              <w:rPr>
+                <w:sz w:val="19"/>
+              </w:rPr>
+              <w:t>14</w:t>
+            </w:r>
+          </w:p>
+        </w:tc>
+        <w:tc>
+          <w:tcPr>
+            <w:tcW w:type="dxa" w:w="567"/>
+            <w:shd w:val="clear" w:color="auto" w:fill="F0F5FC"/>
+          </w:tcPr>
+          <w:p>
+            <w:pPr>
+              <w:spacing w:after="20" w:line="264" w:lineRule="auto"/>
+              <w:jc w:val="center"/>
+            </w:pPr>
+            <w:r/>
+            <w:r>
+              <w:rPr>
+                <w:sz w:val="19"/>
+              </w:rPr>
+              <w:t>0</w:t>
+            </w:r>
+          </w:p>
+        </w:tc>
+        <w:tc>
+          <w:tcPr>
+            <w:tcW w:type="dxa" w:w="794"/>
+            <w:shd w:val="clear" w:color="auto" w:fill="F0F5FC"/>
+          </w:tcPr>
+          <w:p>
+            <w:pPr>
+              <w:spacing w:after="20" w:line="264" w:lineRule="auto"/>
+              <w:jc w:val="center"/>
+            </w:pPr>
+            <w:r/>
+            <w:r>
+              <w:rPr>
+                <w:sz w:val="19"/>
+              </w:rPr>
+              <w:t>17</w:t>
+            </w:r>
+          </w:p>
+        </w:tc>
+        <w:tc>
+          <w:tcPr>
+            <w:tcW w:type="dxa" w:w="1134"/>
+            <w:shd w:val="clear" w:color="auto" w:fill="F0F5FC"/>
+          </w:tcPr>
+          <w:p>
+            <w:pPr>
+              <w:spacing w:after="20" w:line="264" w:lineRule="auto"/>
+              <w:jc w:val="center"/>
+            </w:pPr>
+            <w:r/>
+            <w:r>
+              <w:rPr>
+                <w:sz w:val="19"/>
+              </w:rPr>
+              <w:t>51%</w:t>
+            </w:r>
+          </w:p>
+        </w:tc>
+        <w:tc>
+          <w:tcPr>
+            <w:tcW w:type="dxa" w:w="1417"/>
+            <w:shd w:val="clear" w:color="auto" w:fill="F0F5FC"/>
+          </w:tcPr>
+          <w:p>
+            <w:pPr>
+              <w:spacing w:after="20" w:line="264" w:lineRule="auto"/>
+              <w:jc w:val="center"/>
+            </w:pPr>
+            <w:r/>
+            <w:r>
+              <w:rPr>
+                <w:sz w:val="19"/>
+              </w:rPr>
+              <w:t>78%</w:t>
+            </w:r>
+          </w:p>
+        </w:tc>
+        <w:tc>
+          <w:tcPr>
+            <w:tcW w:type="dxa" w:w="1020"/>
+            <w:shd w:val="clear" w:color="auto" w:fill="F0F5FC"/>
+          </w:tcPr>
+          <w:p>
+            <w:pPr>
+              <w:spacing w:after="20" w:line="264" w:lineRule="auto"/>
+              <w:jc w:val="center"/>
+            </w:pPr>
+            <w:r/>
+            <w:r>
+              <w:rPr>
+                <w:sz w:val="19"/>
+              </w:rPr>
+              <w:t>100%</w:t>
+            </w:r>
+          </w:p>
+        </w:tc>
+      </w:tr>
+    </w:tbl>
+    <w:p>
+      <w:pPr>
+        <w:spacing w:after="40"/>
+      </w:pPr>
+    </w:p>
+    <w:p>
+      <w:pPr>
+        <w:keepNext/>
+        <w:jc w:val="center"/>
+      </w:pPr>
+      <w:r>
+        <w:drawing>
+          <wp:inline xmlns:a="http://schemas.openxmlformats.org/drawingml/2006/main" xmlns:pic="http://schemas.openxmlformats.org/drawingml/2006/picture">
+            <wp:extent cx="5760000" cy="2206205"/>
+            <wp:docPr id="10" name="Picture 10"/>
+            <wp:cNvGraphicFramePr>
+              <a:graphicFrameLocks noChangeAspect="1"/>
+            </wp:cNvGraphicFramePr>
+            <a:graphic>
+              <a:graphicData uri="http://schemas.openxmlformats.org/drawingml/2006/picture">
+                <pic:pic>
+                  <pic:nvPicPr>
+                    <pic:cNvPr id="0" name="fig10_risk_coverage.png"/>
+                    <pic:cNvPicPr/>
+                  </pic:nvPicPr>
+                  <pic:blipFill>
+                    <a:blip r:embed="rId19"/>
+                    <a:stretch>
+                      <a:fillRect/>
+                    </a:stretch>
+                  </pic:blipFill>
+                  <pic:spPr>
+                    <a:xfrm>
+                      <a:off x="0" y="0"/>
+                      <a:ext cx="5760000" cy="2206205"/>
+                    </a:xfrm>
+                    <a:prstGeom prst="rect"/>
+                  </pic:spPr>
+                </pic:pic>
+              </a:graphicData>
+            </a:graphic>
+          </wp:inline>
+        </w:drawing>
+      </w:r>
+    </w:p>
+    <w:p>
+      <w:pPr>
+        <w:pStyle w:val="Caption"/>
+        <w:jc w:val="center"/>
+      </w:pPr>
+      <w:r>
+        <w:t>Hình 10. Risk–coverage: coverage là tỉ lệ câu có đáp án được trả lời, risk là tỉ lệ câu trả lời sai hoặc có claim không được hỗ trợ trong số câu được trả lời (góc dưới phải là tốt nhất)</w:t>
+      </w:r>
+    </w:p>
+    <w:p>
+      <w:pPr>
+        <w:ind w:firstLine="567"/>
+      </w:pPr>
+      <w:r>
+        <w:rPr>
+          <w:b/>
+        </w:rPr>
+        <w:t>Multi-hop, top-k = 4:</w:t>
+      </w:r>
+      <w:r>
+        <w:t xml:space="preserve"> Self-RAG refuse oan 17/35 câu (RAG thuần 5). Trên các câu được trả lời, hallucination rate là 72% so với 83% của RAG thuần và độ đúng gần như nhau (94% so với 97%); số câu đúng và mọi claim có căn cứ là 5 so với 5. Như vậy mức giảm hallucination rate 34,3 điểm % ở mục 7.1 chủ yếu đến từ việc refuse: vòng tự kiểm tra không tạo thêm câu trả lời đúng và có căn cứ, mà bỏ bớt câu trả lời, trong đó có cả câu trả lời đúng.</w:t>
+      </w:r>
+    </w:p>
+    <w:p>
+      <w:pPr>
+        <w:ind w:firstLine="567"/>
+      </w:pPr>
+      <w:r>
+        <w:rPr>
+          <w:b/>
+        </w:rPr>
+        <w:t>Multi-hop, top-k = 8:</w:t>
+      </w:r>
+      <w:r>
+        <w:t xml:space="preserve"> RAG thuần vừa trả lời được nhiều câu hơn (coverage 91% so với 51%) vừa có risk thấp hơn (62% so với 78%), tức là ở điều kiện này Self-RAG không có lợi thế. Ở câu single-hop, bốn điểm của hai hệ nằm sát nhau. Đây là mô tả, không kiểm định: tập câu được trả lời của hai hệ khác nhau, và mỗi hệ chỉ có một điểm trên đường risk–coverage ở mỗi điều kiện (không có ngưỡng để quét).</w:t>
+      </w:r>
+    </w:p>
+    <w:p>
+      <w:pPr>
+        <w:ind w:firstLine="567"/>
+      </w:pPr>
+      <w:r>
+        <w:rPr>
+          <w:b/>
+        </w:rPr>
+        <w:t>Hallucination ở mức claim:</w:t>
+      </w:r>
+      <w:r>
+        <w:t xml:space="preserve"> mỗi câu trả lời của RAG thuần có trung bình 4,5 claim ở câu single-hop và 6,0 claim ở câu multi-hop; tỉ lệ claim không được hỗ trợ là 10,2% và 21,7%. Nếu các claim lỗi độc lập, xác suất một câu trả lời single-hop có ít nhất một claim lỗi là 1 − (1 − 0,102)^4,5 ≈ 38%, gần với hallucination rate quan sát trên câu có trả lời (33%). Hallucination rate theo câu vì vậy khuếch đại tỉ lệ claim lỗi: con số khoảng 30% ở câu single-hop tương ứng với khoảng một claim trên mười không được judge xác nhận, không phải 30% câu trả lời bị bịa. Ngoài ra, đối chiếu với human judge ở nội dung 2 (cùng judge và cùng prompt verify claim) cho thấy judge chấm nhiều câu trả lời có claim không được hỗ trợ hơn hẳn người chấm (53% so với 16%), nên mức tuyệt đối của hallucination rate ở đây có thể cao hơn thực tế; so sánh giữa hai hệ dùng cùng judge nên ít bị ảnh hưởng hơn.</w:t>
+      </w:r>
+    </w:p>
+    <w:p>
+      <w:pPr>
         <w:pStyle w:val="Heading1"/>
       </w:pPr>
       <w:r>
@@ -5199,7 +6943,7 @@
         <w:t xml:space="preserve">Judge: </w:t>
       </w:r>
       <w:r>
-        <w:t>llama3.1:8b có nhiễu khi chấm từng claim; chưa có đánh giá của con người để đối chứng. Kết luận chỉ dựa trên các chênh lệch có statistical significance.</w:t>
+        <w:t>llama3.1:8b có nhiễu khi chấm từng claim; ở nội dung 2, cùng prompt verify claim chấm khắt khe hơn human judge (mục 7.5). Kết luận chỉ dựa trên các chênh lệch có statistical significance sau hiệu chỉnh Holm.</w:t>
       </w:r>
     </w:p>
     <w:p>
@@ -5245,7 +6989,7 @@
         <w:ind w:firstLine="567"/>
       </w:pPr>
       <w:r>
-        <w:t>Trên 144 câu hỏi, với top-k = 4: ở câu hỏi một đoạn, không đủ bằng chứng để phân biệt LangChain RAG và LangGraph Self-RAG trên cả ba chỉ số. Ở câu hỏi tổng hợp hai bài, Self-RAG giảm hallucination rate từ 71% xuống 37%, phần lớn nhờ refuse nhiều hơn (câu refusal có hallucination = 0; chỉ tính câu có trả lời, mức giảm nhỏ hơn nhiều, mục 7.4), và tăng faithfulness trên các câu cả hai hệ cùng trả lời, nhưng answer relevancy giảm từ 0,70 xuống 0,42 và độ đúng so với ground truth giảm, cũng do refuse nhiều hơn. Ở câu hỏi out-of-corpus, cả hai hệ đều refuse đúng toàn bộ. Self-RAG phù hợp khi ưu tiên tránh câu trả lời không có căn cứ hơn là trả lời được nhiều câu, với chi phí tính toán cao hơn.</w:t>
+        <w:t>Trên 144 câu hỏi, với top-k = 4: ở câu hỏi một đoạn, không đủ bằng chứng để phân biệt LangChain RAG và LangGraph Self-RAG (bản xấp xỉ bằng prompt trên mô hình 7B) trên cả ba chỉ số. Ở câu hỏi tổng hợp hai bài, Self-RAG giảm hallucination rate từ 71% xuống 37%, nhưng mức giảm này chủ yếu do refuse nhiều hơn: chỉ tính câu có trả lời, hallucination rate là 72% so với 83%, và số câu đúng, mọi claim có căn cứ không tăng (5 so với 5, mục 7.5). Faithfulness trên các câu cả hai hệ cùng trả lời có xu hướng cao hơn ở Self-RAG nhưng không qua hiệu chỉnh đa so sánh. Answer relevancy giảm từ 0,70 xuống 0,42 và độ đúng so với ground truth giảm, cũng do refuse nhiều hơn. Ở câu hỏi out-of-corpus, cả hai hệ đều refuse đúng toàn bộ. Trong cài đặt này, vòng tự kiểm tra của Self-RAG chủ yếu hoạt động như một cơ chế refuse: nó chỉ phù hợp khi ưu tiên trả lời ít câu hơn là trả lời được nhiều câu, với chi phí tính toán cao hơn; chưa rõ nó có tốt hơn một quy tắc refuse đơn giản ở cùng coverage hay không.</w:t>
       </w:r>
     </w:p>
     <w:p>
@@ -5253,7 +6997,7 @@
         <w:ind w:firstLine="567"/>
       </w:pPr>
       <w:r>
-        <w:t>Khi tăng top-k lên 8 (nhiều đoạn không liên quan), ở câu một đoạn Self-RAG có xu hướng ít hallucination hơn (28% so với 34%) nhưng chưa có statistical significance; ở câu tổng hợp, RAG thuần cải thiện nhờ có đủ tài liệu hơn nên chênh lệch hallucination rate thu hẹp (57% so với 40%, không có statistical significance), trong khi answer relevancy của Self-RAG vẫn thấp hơn rõ rệt.</w:t>
+        <w:t>Khi tăng top-k lên 8 (nhiều đoạn không liên quan), ở câu một đoạn Self-RAG có xu hướng ít hallucination hơn (28% so với 34%) nhưng chưa có statistical significance; ở câu tổng hợp, RAG thuần cải thiện nhờ có đủ tài liệu hơn nên chênh lệch hallucination rate thu hẹp (57% so với 40%, không có statistical significance), trong khi answer relevancy của Self-RAG vẫn thấp hơn rõ rệt; trên đường risk–coverage, RAG thuần với top-k = 8 vừa trả lời nhiều câu hơn vừa có risk thấp hơn Self-RAG.</w:t>
       </w:r>
     </w:p>
     <w:sectPr>

</xml_diff>

<commit_message>
Chấm tay 100 câu trả lời của nội dung 1, 3, 4 và đưa kết quả vào báo cáo
- human_audit.py: phiếu chấm mù (claim: có / không có trong context / mâu thuẫn; độ đúng),
  mẫu seed 42 gồm 40 câu single-hop Y1 (20 judge gắn hallucination, 20 không), 10 câu multi-hop,
  25 câu Y3, 25 câu Y4; gộp với 36 câu Y2 đã chấm trước -> agreement, κ, faithfulness
- Kết quả: judge gắn hallucination 60% so với 17% của người chấm (κ 0,19), cho đúng 94% so với
  69% (κ 0,20); ở 20 câu single-hop judge gắn hallucination, người chấm chỉ đồng ý 2 câu
- Báo cáo Y1 mục 7.5, 7.6 (bảng mới), thảo luận, kết luận; Y2 mục 8.5; Y3 mục 6.4; Y4 mục 5.6;
  thêm tài liệu đối chiếu về LLM-as-a-judge; README
</commit_message>
<xml_diff>
--- a/report/Bao_cao_Y1.docx
+++ b/report/Bao_cao_Y1.docx
@@ -8668,7 +8668,7 @@
         <w:t>Hallucination ở mức claim:</w:t>
       </w:r>
       <w:r>
-        <w:t xml:space="preserve"> mỗi câu trả lời của RAG thuần có trung bình 4,5 claim ở câu single-hop và 6,2 claim ở câu multi-hop; tỉ lệ claim không được hỗ trợ là 9,8% và 18,7%. Nếu các claim lỗi độc lập, xác suất một câu trả lời single-hop có ít nhất một claim lỗi là 1 − (1 − 0,098)^4,5 ≈ 37%, gần với hallucination rate quan sát trên câu có trả lời (30%). Hallucination rate theo câu vì vậy khuếch đại tỉ lệ claim lỗi: con số khoảng 30% ở câu single-hop tương ứng với khoảng một claim trên mười không được judge xác nhận, không phải 30% câu trả lời bị bịa. Lấy đúng bài báo chưa chắc lấy đúng đoạn: ở câu single-hop, RAG thuần có bài nguồn trong top-4 ở 97% số câu nhưng chỉ lấy được gold chunk (đoạn dùng để sinh câu hỏi) ở 78%, nên một phần claim không được hỗ trợ có thể đến từ thông tin nằm ở đoạn khác của bài. Ngoài ra, đối chiếu với human judge ở nội dung 2 (cùng judge và cùng prompt verify claim) cho thấy judge chấm nhiều câu trả lời có claim không được hỗ trợ hơn hẳn người chấm (53% so với 16%), nên mức tuyệt đối của hallucination rate ở đây có thể cao hơn thực tế; so sánh giữa hai hệ dùng cùng judge nên ít bị ảnh hưởng hơn.</w:t>
+        <w:t xml:space="preserve"> mỗi câu trả lời của RAG thuần có trung bình 4,5 claim ở câu single-hop và 6,2 claim ở câu multi-hop; tỉ lệ claim không được hỗ trợ là 9,8% và 18,7%. Nếu các claim lỗi độc lập, xác suất một câu trả lời single-hop có ít nhất một claim lỗi là 1 − (1 − 0,098)^4,5 ≈ 37%, gần với hallucination rate quan sát trên câu có trả lời (30%). Hallucination rate theo câu vì vậy khuếch đại tỉ lệ claim lỗi: con số khoảng 30% ở câu single-hop tương ứng với khoảng một claim trên mười không được judge xác nhận, không phải 30% câu trả lời bị bịa. Lấy đúng bài báo chưa chắc lấy đúng đoạn: ở câu single-hop, RAG thuần có bài nguồn trong top-4 ở 97% số câu nhưng chỉ lấy được gold chunk (đoạn dùng để sinh câu hỏi) ở 78%, nên một phần claim không được hỗ trợ có thể đến từ thông tin nằm ở đoạn khác của bài. Chấm tay 40 câu trả lời single-hop của RAG thuần (mục 7.6) cho thấy nguyên nhân chủ yếu nằm ở judge: trong 20 câu judge gắn hallucination, người chấm chỉ thấy claim không được hỗ trợ ở 2 câu (trong đó 2 câu có claim mâu thuẫn context); ở 20 câu judge không gắn, người chấm cũng không thấy câu nào. Trên 180 claim của mẫu, người chấm không thấy claim nào nằm ngoài context, chỉ thấy 3 claim mâu thuẫn context. Trong ba cách giải thích (judge khắt khe, chỉ số theo câu khuếch đại lỗi claim, mô hình thêm thông tin nằm ngoài đoạn truy xuất), dữ liệu chấm tay ủng hộ cách thứ nhất: hallucination rate tuyệt đối ở câu single-hop cao hơn thực tế nhiều. So sánh giữa hai hệ dùng cùng judge nên ít bị ảnh hưởng hơn, nhưng điều này chưa kiểm chứng được trên câu multi-hop vì mẫu chấm tay chỉ có 5 câu mỗi hệ.</w:t>
       </w:r>
     </w:p>
     <w:p>
@@ -8676,7 +8676,7 @@
         <w:pStyle w:val="Heading2"/>
       </w:pPr>
       <w:r>
-        <w:t>7.6. Độ tin cậy của judge: chấm 3 lần và thử lại khi lỗi</w:t>
+        <w:t>7.6. Độ tin cậy của judge: chấm 3 lần, thử lại khi lỗi và đối chiếu với người chấm</w:t>
       </w:r>
     </w:p>
     <w:p>
@@ -9605,6 +9605,662 @@
       </w:pPr>
       <w:r>
         <w:t>Ở bảng chính, mỗi câu trả lời được chấm 3 lần. Nhãn hallucination và độ đúng gần như trùng ở mọi lần; faithfulness lệch ở một phần nhỏ số câu vì danh sách claim do judge tách ra có thể khác nhau giữa các lần, nhưng sai khác trung bình dưới 0,02, nhỏ so với các chênh lệch dùng để kết luận. Trong 4.580 lần gọi judge, 12 lần lỗi (JSON hỏng, Ollama huỷ hoặc thiếu verdict); sau khi thử lại chỉ còn 1 lần chưa có verdict, và không prompt nào bị truncate.</w:t>
+      </w:r>
+    </w:p>
+    <w:p>
+      <w:pPr>
+        <w:ind w:firstLine="567"/>
+      </w:pPr>
+      <w:r>
+        <w:rPr>
+          <w:b/>
+        </w:rPr>
+        <w:t>Đối chiếu với người chấm.</w:t>
+      </w:r>
+      <w:r>
+        <w:t xml:space="preserve"> Một mẫu câu trả lời được chấm tay theo đúng hai loại nhãn mà judge gán: từng claim (do judge tách) có được context hỗ trợ không, phân biệt claim không có trong context với claim mâu thuẫn context; và câu trả lời có đúng so với ground truth không. Mẫu của nội dung 1 (seed 42, chỉ câu có đáp án mà hệ không refuse) gồm 40 câu single-hop của RAG thuần, chọn 20 câu judge gắn hallucination và 20 câu không, cùng 10 câu multi-hop (5 câu mỗi hệ). Cùng đợt có 25 câu trả lời của nội dung 3 và 25 câu của nội dung 4; cộng với 32 câu của nội dung 2 đã chấm trước đó, mẫu gồm 132 câu trả lời. Phiếu chấm xáo thứ tự, không ghi hệ và không có điểm judge; một người chấm.</w:t>
+      </w:r>
+    </w:p>
+    <w:p>
+      <w:pPr>
+        <w:pStyle w:val="Caption"/>
+        <w:keepNext/>
+        <w:jc w:val="center"/>
+      </w:pPr>
+      <w:r>
+        <w:t>Bảng 15. Người chấm so với judge ở mức câu trả lời (CI 95% bootstrap theo câu trả lời)</w:t>
+      </w:r>
+    </w:p>
+    <w:tbl>
+      <w:tblPr>
+        <w:tblStyle w:val="TableGrid"/>
+        <w:tblW w:type="auto" w:w="0"/>
+        <w:jc w:val="center"/>
+        <w:tblLayout w:type="fixed"/>
+        <w:tblLook w:firstColumn="1" w:firstRow="1" w:lastColumn="0" w:lastRow="0" w:noHBand="0" w:noVBand="1" w:val="04A0"/>
+      </w:tblPr>
+      <w:tblGrid>
+        <w:gridCol w:w="1512"/>
+        <w:gridCol w:w="1512"/>
+        <w:gridCol w:w="1512"/>
+        <w:gridCol w:w="1512"/>
+        <w:gridCol w:w="1512"/>
+        <w:gridCol w:w="1512"/>
+      </w:tblGrid>
+      <w:tr>
+        <w:trPr>
+          <w:tblHeader w:val="true"/>
+          <w:cantSplit w:val="true"/>
+        </w:trPr>
+        <w:tc>
+          <w:tcPr>
+            <w:tcW w:type="dxa" w:w="1474"/>
+            <w:shd w:val="clear" w:color="auto" w:fill="1C5CAB"/>
+          </w:tcPr>
+          <w:p>
+            <w:pPr>
+              <w:spacing w:after="20" w:line="264" w:lineRule="auto"/>
+              <w:jc w:val="center"/>
+            </w:pPr>
+            <w:r/>
+            <w:r>
+              <w:rPr>
+                <w:b/>
+                <w:color w:val="FFFFFF"/>
+                <w:sz w:val="20"/>
+              </w:rPr>
+              <w:t>Phạm vi</w:t>
+            </w:r>
+          </w:p>
+        </w:tc>
+        <w:tc>
+          <w:tcPr>
+            <w:tcW w:type="dxa" w:w="2041"/>
+            <w:shd w:val="clear" w:color="auto" w:fill="1C5CAB"/>
+          </w:tcPr>
+          <w:p>
+            <w:pPr>
+              <w:spacing w:after="20" w:line="264" w:lineRule="auto"/>
+              <w:jc w:val="center"/>
+            </w:pPr>
+            <w:r/>
+            <w:r>
+              <w:rPr>
+                <w:b/>
+                <w:color w:val="FFFFFF"/>
+                <w:sz w:val="20"/>
+              </w:rPr>
+              <w:t>Nhãn</w:t>
+            </w:r>
+          </w:p>
+        </w:tc>
+        <w:tc>
+          <w:tcPr>
+            <w:tcW w:type="dxa" w:w="794"/>
+            <w:shd w:val="clear" w:color="auto" w:fill="1C5CAB"/>
+          </w:tcPr>
+          <w:p>
+            <w:pPr>
+              <w:spacing w:after="20" w:line="264" w:lineRule="auto"/>
+              <w:jc w:val="center"/>
+            </w:pPr>
+            <w:r/>
+            <w:r>
+              <w:rPr>
+                <w:b/>
+                <w:color w:val="FFFFFF"/>
+                <w:sz w:val="20"/>
+              </w:rPr>
+              <w:t>Số câu</w:t>
+            </w:r>
+          </w:p>
+        </w:tc>
+        <w:tc>
+          <w:tcPr>
+            <w:tcW w:type="dxa" w:w="1701"/>
+            <w:shd w:val="clear" w:color="auto" w:fill="1C5CAB"/>
+          </w:tcPr>
+          <w:p>
+            <w:pPr>
+              <w:spacing w:after="20" w:line="264" w:lineRule="auto"/>
+              <w:jc w:val="center"/>
+            </w:pPr>
+            <w:r/>
+            <w:r>
+              <w:rPr>
+                <w:b/>
+                <w:color w:val="FFFFFF"/>
+                <w:sz w:val="20"/>
+              </w:rPr>
+              <w:t>Tỉ lệ "có": người / judge</w:t>
+            </w:r>
+          </w:p>
+        </w:tc>
+        <w:tc>
+          <w:tcPr>
+            <w:tcW w:type="dxa" w:w="1644"/>
+            <w:shd w:val="clear" w:color="auto" w:fill="1C5CAB"/>
+          </w:tcPr>
+          <w:p>
+            <w:pPr>
+              <w:spacing w:after="20" w:line="264" w:lineRule="auto"/>
+              <w:jc w:val="center"/>
+            </w:pPr>
+            <w:r/>
+            <w:r>
+              <w:rPr>
+                <w:b/>
+                <w:color w:val="FFFFFF"/>
+                <w:sz w:val="20"/>
+              </w:rPr>
+              <w:t>% khớp [CI 95%]</w:t>
+            </w:r>
+          </w:p>
+        </w:tc>
+        <w:tc>
+          <w:tcPr>
+            <w:tcW w:type="dxa" w:w="1701"/>
+            <w:shd w:val="clear" w:color="auto" w:fill="1C5CAB"/>
+          </w:tcPr>
+          <w:p>
+            <w:pPr>
+              <w:spacing w:after="20" w:line="264" w:lineRule="auto"/>
+              <w:jc w:val="center"/>
+            </w:pPr>
+            <w:r/>
+            <w:r>
+              <w:rPr>
+                <w:b/>
+                <w:color w:val="FFFFFF"/>
+                <w:sz w:val="20"/>
+              </w:rPr>
+              <w:t>Cohen's κ [CI 95%]</w:t>
+            </w:r>
+          </w:p>
+        </w:tc>
+      </w:tr>
+      <w:tr>
+        <w:trPr>
+          <w:cantSplit w:val="true"/>
+        </w:trPr>
+        <w:tc>
+          <w:tcPr>
+            <w:tcW w:type="dxa" w:w="1474"/>
+          </w:tcPr>
+          <w:p>
+            <w:pPr>
+              <w:spacing w:after="20" w:line="264" w:lineRule="auto"/>
+              <w:jc w:val="left"/>
+            </w:pPr>
+            <w:r>
+              <w:rPr>
+                <w:b/>
+              </w:rPr>
+            </w:r>
+            <w:r>
+              <w:rPr>
+                <w:b/>
+                <w:sz w:val="20"/>
+              </w:rPr>
+              <w:t>Nội dung 1</w:t>
+            </w:r>
+          </w:p>
+        </w:tc>
+        <w:tc>
+          <w:tcPr>
+            <w:tcW w:type="dxa" w:w="2041"/>
+          </w:tcPr>
+          <w:p>
+            <w:pPr>
+              <w:spacing w:after="20" w:line="264" w:lineRule="auto"/>
+              <w:jc w:val="left"/>
+            </w:pPr>
+            <w:r/>
+            <w:r>
+              <w:rPr>
+                <w:sz w:val="20"/>
+              </w:rPr>
+              <w:t>Có claim không được hỗ trợ</w:t>
+            </w:r>
+          </w:p>
+        </w:tc>
+        <w:tc>
+          <w:tcPr>
+            <w:tcW w:type="dxa" w:w="794"/>
+          </w:tcPr>
+          <w:p>
+            <w:pPr>
+              <w:spacing w:after="20" w:line="264" w:lineRule="auto"/>
+              <w:jc w:val="center"/>
+            </w:pPr>
+            <w:r/>
+            <w:r>
+              <w:rPr>
+                <w:sz w:val="20"/>
+              </w:rPr>
+              <w:t>50</w:t>
+            </w:r>
+          </w:p>
+        </w:tc>
+        <w:tc>
+          <w:tcPr>
+            <w:tcW w:type="dxa" w:w="1701"/>
+          </w:tcPr>
+          <w:p>
+            <w:pPr>
+              <w:spacing w:after="20" w:line="264" w:lineRule="auto"/>
+              <w:jc w:val="center"/>
+            </w:pPr>
+            <w:r/>
+            <w:r>
+              <w:rPr>
+                <w:sz w:val="20"/>
+              </w:rPr>
+              <w:t>12% / 60%</w:t>
+            </w:r>
+          </w:p>
+        </w:tc>
+        <w:tc>
+          <w:tcPr>
+            <w:tcW w:type="dxa" w:w="1644"/>
+          </w:tcPr>
+          <w:p>
+            <w:pPr>
+              <w:spacing w:after="20" w:line="264" w:lineRule="auto"/>
+              <w:jc w:val="center"/>
+            </w:pPr>
+            <w:r/>
+            <w:r>
+              <w:rPr>
+                <w:sz w:val="20"/>
+              </w:rPr>
+              <w:t>52% [38%; 66%]</w:t>
+            </w:r>
+          </w:p>
+        </w:tc>
+        <w:tc>
+          <w:tcPr>
+            <w:tcW w:type="dxa" w:w="1701"/>
+          </w:tcPr>
+          <w:p>
+            <w:pPr>
+              <w:spacing w:after="20" w:line="264" w:lineRule="auto"/>
+              <w:jc w:val="center"/>
+            </w:pPr>
+            <w:r/>
+            <w:r>
+              <w:rPr>
+                <w:sz w:val="20"/>
+              </w:rPr>
+              <w:t>0,17 [0,05; 0,32]</w:t>
+            </w:r>
+          </w:p>
+        </w:tc>
+      </w:tr>
+      <w:tr>
+        <w:trPr>
+          <w:cantSplit w:val="true"/>
+        </w:trPr>
+        <w:tc>
+          <w:tcPr>
+            <w:tcW w:type="dxa" w:w="1474"/>
+            <w:shd w:val="clear" w:color="auto" w:fill="F0F5FC"/>
+          </w:tcPr>
+          <w:p>
+            <w:pPr>
+              <w:spacing w:after="20" w:line="264" w:lineRule="auto"/>
+              <w:jc w:val="left"/>
+            </w:pPr>
+            <w:r>
+              <w:rPr>
+                <w:b/>
+              </w:rPr>
+            </w:r>
+          </w:p>
+        </w:tc>
+        <w:tc>
+          <w:tcPr>
+            <w:tcW w:type="dxa" w:w="2041"/>
+            <w:shd w:val="clear" w:color="auto" w:fill="F0F5FC"/>
+          </w:tcPr>
+          <w:p>
+            <w:pPr>
+              <w:spacing w:after="20" w:line="264" w:lineRule="auto"/>
+              <w:jc w:val="left"/>
+            </w:pPr>
+            <w:r/>
+            <w:r>
+              <w:rPr>
+                <w:sz w:val="20"/>
+              </w:rPr>
+              <w:t>Câu trả lời đúng</w:t>
+            </w:r>
+          </w:p>
+        </w:tc>
+        <w:tc>
+          <w:tcPr>
+            <w:tcW w:type="dxa" w:w="794"/>
+            <w:shd w:val="clear" w:color="auto" w:fill="F0F5FC"/>
+          </w:tcPr>
+          <w:p>
+            <w:pPr>
+              <w:spacing w:after="20" w:line="264" w:lineRule="auto"/>
+              <w:jc w:val="center"/>
+            </w:pPr>
+            <w:r/>
+            <w:r>
+              <w:rPr>
+                <w:sz w:val="20"/>
+              </w:rPr>
+              <w:t>50</w:t>
+            </w:r>
+          </w:p>
+        </w:tc>
+        <w:tc>
+          <w:tcPr>
+            <w:tcW w:type="dxa" w:w="1701"/>
+            <w:shd w:val="clear" w:color="auto" w:fill="F0F5FC"/>
+          </w:tcPr>
+          <w:p>
+            <w:pPr>
+              <w:spacing w:after="20" w:line="264" w:lineRule="auto"/>
+              <w:jc w:val="center"/>
+            </w:pPr>
+            <w:r/>
+            <w:r>
+              <w:rPr>
+                <w:sz w:val="20"/>
+              </w:rPr>
+              <w:t>84% / 96%</w:t>
+            </w:r>
+          </w:p>
+        </w:tc>
+        <w:tc>
+          <w:tcPr>
+            <w:tcW w:type="dxa" w:w="1644"/>
+            <w:shd w:val="clear" w:color="auto" w:fill="F0F5FC"/>
+          </w:tcPr>
+          <w:p>
+            <w:pPr>
+              <w:spacing w:after="20" w:line="264" w:lineRule="auto"/>
+              <w:jc w:val="center"/>
+            </w:pPr>
+            <w:r/>
+            <w:r>
+              <w:rPr>
+                <w:sz w:val="20"/>
+              </w:rPr>
+              <w:t>88% [78%; 96%]</w:t>
+            </w:r>
+          </w:p>
+        </w:tc>
+        <w:tc>
+          <w:tcPr>
+            <w:tcW w:type="dxa" w:w="1701"/>
+            <w:shd w:val="clear" w:color="auto" w:fill="F0F5FC"/>
+          </w:tcPr>
+          <w:p>
+            <w:pPr>
+              <w:spacing w:after="20" w:line="264" w:lineRule="auto"/>
+              <w:jc w:val="center"/>
+            </w:pPr>
+            <w:r/>
+            <w:r>
+              <w:rPr>
+                <w:sz w:val="20"/>
+              </w:rPr>
+              <w:t>0,36 [0,00; 0,73]</w:t>
+            </w:r>
+          </w:p>
+        </w:tc>
+      </w:tr>
+      <w:tr>
+        <w:trPr>
+          <w:cantSplit w:val="true"/>
+        </w:trPr>
+        <w:tc>
+          <w:tcPr>
+            <w:tcW w:type="dxa" w:w="1474"/>
+          </w:tcPr>
+          <w:p>
+            <w:pPr>
+              <w:spacing w:after="20" w:line="264" w:lineRule="auto"/>
+              <w:jc w:val="left"/>
+            </w:pPr>
+            <w:r>
+              <w:rPr>
+                <w:b/>
+              </w:rPr>
+            </w:r>
+            <w:r>
+              <w:rPr>
+                <w:b/>
+                <w:sz w:val="20"/>
+              </w:rPr>
+              <w:t>Nội dung 1–4</w:t>
+            </w:r>
+          </w:p>
+        </w:tc>
+        <w:tc>
+          <w:tcPr>
+            <w:tcW w:type="dxa" w:w="2041"/>
+          </w:tcPr>
+          <w:p>
+            <w:pPr>
+              <w:spacing w:after="20" w:line="264" w:lineRule="auto"/>
+              <w:jc w:val="left"/>
+            </w:pPr>
+            <w:r/>
+            <w:r>
+              <w:rPr>
+                <w:sz w:val="20"/>
+              </w:rPr>
+              <w:t>Có claim không được hỗ trợ</w:t>
+            </w:r>
+          </w:p>
+        </w:tc>
+        <w:tc>
+          <w:tcPr>
+            <w:tcW w:type="dxa" w:w="794"/>
+          </w:tcPr>
+          <w:p>
+            <w:pPr>
+              <w:spacing w:after="20" w:line="264" w:lineRule="auto"/>
+              <w:jc w:val="center"/>
+            </w:pPr>
+            <w:r/>
+            <w:r>
+              <w:rPr>
+                <w:sz w:val="20"/>
+              </w:rPr>
+              <w:t>132</w:t>
+            </w:r>
+          </w:p>
+        </w:tc>
+        <w:tc>
+          <w:tcPr>
+            <w:tcW w:type="dxa" w:w="1701"/>
+          </w:tcPr>
+          <w:p>
+            <w:pPr>
+              <w:spacing w:after="20" w:line="264" w:lineRule="auto"/>
+              <w:jc w:val="center"/>
+            </w:pPr>
+            <w:r/>
+            <w:r>
+              <w:rPr>
+                <w:sz w:val="20"/>
+              </w:rPr>
+              <w:t>17% / 60%</w:t>
+            </w:r>
+          </w:p>
+        </w:tc>
+        <w:tc>
+          <w:tcPr>
+            <w:tcW w:type="dxa" w:w="1644"/>
+          </w:tcPr>
+          <w:p>
+            <w:pPr>
+              <w:spacing w:after="20" w:line="264" w:lineRule="auto"/>
+              <w:jc w:val="center"/>
+            </w:pPr>
+            <w:r/>
+            <w:r>
+              <w:rPr>
+                <w:sz w:val="20"/>
+              </w:rPr>
+              <w:t>55% [46%; 63%]</w:t>
+            </w:r>
+          </w:p>
+        </w:tc>
+        <w:tc>
+          <w:tcPr>
+            <w:tcW w:type="dxa" w:w="1701"/>
+          </w:tcPr>
+          <w:p>
+            <w:pPr>
+              <w:spacing w:after="20" w:line="264" w:lineRule="auto"/>
+              <w:jc w:val="center"/>
+            </w:pPr>
+            <w:r/>
+            <w:r>
+              <w:rPr>
+                <w:sz w:val="20"/>
+              </w:rPr>
+              <w:t>0,19 [0,10; 0,30]</w:t>
+            </w:r>
+          </w:p>
+        </w:tc>
+      </w:tr>
+      <w:tr>
+        <w:trPr>
+          <w:cantSplit w:val="true"/>
+        </w:trPr>
+        <w:tc>
+          <w:tcPr>
+            <w:tcW w:type="dxa" w:w="1474"/>
+            <w:shd w:val="clear" w:color="auto" w:fill="F0F5FC"/>
+          </w:tcPr>
+          <w:p>
+            <w:pPr>
+              <w:spacing w:after="20" w:line="264" w:lineRule="auto"/>
+              <w:jc w:val="left"/>
+            </w:pPr>
+            <w:r>
+              <w:rPr>
+                <w:b/>
+              </w:rPr>
+            </w:r>
+          </w:p>
+        </w:tc>
+        <w:tc>
+          <w:tcPr>
+            <w:tcW w:type="dxa" w:w="2041"/>
+            <w:shd w:val="clear" w:color="auto" w:fill="F0F5FC"/>
+          </w:tcPr>
+          <w:p>
+            <w:pPr>
+              <w:spacing w:after="20" w:line="264" w:lineRule="auto"/>
+              <w:jc w:val="left"/>
+            </w:pPr>
+            <w:r/>
+            <w:r>
+              <w:rPr>
+                <w:sz w:val="20"/>
+              </w:rPr>
+              <w:t>Câu trả lời đúng</w:t>
+            </w:r>
+          </w:p>
+        </w:tc>
+        <w:tc>
+          <w:tcPr>
+            <w:tcW w:type="dxa" w:w="794"/>
+            <w:shd w:val="clear" w:color="auto" w:fill="F0F5FC"/>
+          </w:tcPr>
+          <w:p>
+            <w:pPr>
+              <w:spacing w:after="20" w:line="264" w:lineRule="auto"/>
+              <w:jc w:val="center"/>
+            </w:pPr>
+            <w:r/>
+            <w:r>
+              <w:rPr>
+                <w:sz w:val="20"/>
+              </w:rPr>
+              <w:t>132</w:t>
+            </w:r>
+          </w:p>
+        </w:tc>
+        <w:tc>
+          <w:tcPr>
+            <w:tcW w:type="dxa" w:w="1701"/>
+            <w:shd w:val="clear" w:color="auto" w:fill="F0F5FC"/>
+          </w:tcPr>
+          <w:p>
+            <w:pPr>
+              <w:spacing w:after="20" w:line="264" w:lineRule="auto"/>
+              <w:jc w:val="center"/>
+            </w:pPr>
+            <w:r/>
+            <w:r>
+              <w:rPr>
+                <w:sz w:val="20"/>
+              </w:rPr>
+              <w:t>69% / 94%</w:t>
+            </w:r>
+          </w:p>
+        </w:tc>
+        <w:tc>
+          <w:tcPr>
+            <w:tcW w:type="dxa" w:w="1644"/>
+            <w:shd w:val="clear" w:color="auto" w:fill="F0F5FC"/>
+          </w:tcPr>
+          <w:p>
+            <w:pPr>
+              <w:spacing w:after="20" w:line="264" w:lineRule="auto"/>
+              <w:jc w:val="center"/>
+            </w:pPr>
+            <w:r/>
+            <w:r>
+              <w:rPr>
+                <w:sz w:val="20"/>
+              </w:rPr>
+              <w:t>74% [66%; 80%]</w:t>
+            </w:r>
+          </w:p>
+        </w:tc>
+        <w:tc>
+          <w:tcPr>
+            <w:tcW w:type="dxa" w:w="1701"/>
+            <w:shd w:val="clear" w:color="auto" w:fill="F0F5FC"/>
+          </w:tcPr>
+          <w:p>
+            <w:pPr>
+              <w:spacing w:after="20" w:line="264" w:lineRule="auto"/>
+              <w:jc w:val="center"/>
+            </w:pPr>
+            <w:r/>
+            <w:r>
+              <w:rPr>
+                <w:sz w:val="20"/>
+              </w:rPr>
+              <w:t>0,20 [0,07; 0,35]</w:t>
+            </w:r>
+          </w:p>
+        </w:tc>
+      </w:tr>
+    </w:tbl>
+    <w:p>
+      <w:pPr>
+        <w:spacing w:after="40"/>
+      </w:pPr>
+    </w:p>
+    <w:p>
+      <w:pPr>
+        <w:ind w:firstLine="567"/>
+      </w:pPr>
+      <w:r>
+        <w:t>Mẫu nội dung 1 chọn theo nhãn judge nên tỉ lệ "có" của judge trong mẫu (60%) không phải tỉ lệ thật; điều đáng chú ý là chiều lệch. Judge gắn hallucination ở 58 câu trả lời mà người chấm thấy mọi claim được hỗ trợ, chiều ngược lại chỉ 2 câu; ngược lại, judge cho đúng 34 câu mà người chấm cho sai và chiều ngược lại 1 câu. Faithfulness trung bình của judge là 0,81 so với 0,96 của người chấm ở nội dung 1 (0,82 so với 0,94 trên cả bốn nội dung, tương quan Pearson 0,35). Như vậy judge khắt khe ở bước kiểm tra claim và dễ dãi ở bước chấm độ đúng, và việc 3 lần chấm gần như trùng nhau không có nghĩa là judge đúng. Kết quả này khớp với các nghiên cứu về judge cỡ nhỏ: judge Llama-3-8B chạy cục bộ lặp lại điểm của chính nó 97% nhưng tương quan với người chỉ 0,28 [10]; judge nhỏ có xu hướng dễ dãi và khớp người kém hơn judge lớn [8]; còn judge mạnh như GPT-4 khớp người khoảng 85%, ngang mức hai người khớp nhau [9].</w:t>
       </w:r>
     </w:p>
     <w:p>
@@ -9687,7 +10343,7 @@
         <w:t xml:space="preserve">Judge: </w:t>
       </w:r>
       <w:r>
-        <w:t>chấm 3 lần cho kết quả gần như trùng nhau (mục 7.6), nhưng ở nội dung 2 cùng prompt verify claim chấm khắt khe hơn human judge (mục 7.5) và các judge 7–8B nói chung có agreement thấp với người [8]. Kết luận chỉ dựa trên các chênh lệch có statistical significance sau hiệu chỉnh Holm.</w:t>
+        <w:t>chấm 3 lần cho kết quả gần như trùng nhau nhưng khớp kém với người chấm (mục 7.6): judge gắn hallucination nhiều hơn người chấm nhiều và chấm độ đúng dễ dãi hơn, giống các nghiên cứu về judge 7–8B [8, 10]. Vì vậy hallucination rate và độ đúng tuyệt đối trong báo cáo đều nên đọc như cận trên; kết luận chỉ dựa trên các chênh lệch giữa hai hệ có statistical significance sau hiệu chỉnh Holm. Mẫu chấm tay chỉ có một người chấm nên chưa có độ khớp giữa người chấm, và mỗi hệ ở câu multi-hop chỉ có 5 câu nên chưa kiểm chứng được riêng chênh lệch hallucination giữa hai hệ.</w:t>
       </w:r>
     </w:p>
     <w:p>
@@ -9748,7 +10404,7 @@
         <w:ind w:firstLine="567"/>
       </w:pPr>
       <w:r>
-        <w:t>Trên 144 câu hỏi, với top-k = 4: ở câu hỏi một đoạn, không đủ bằng chứng để phân biệt LangChain RAG và LangGraph Self-RAG (bản xấp xỉ bằng prompt trên mô hình 7B) trên cả ba chỉ số. Ở câu hỏi tổng hợp hai bài, Self-RAG giảm hallucination rate từ 71% xuống 37%, nhưng mức giảm này chủ yếu do refuse nhiều hơn: chỉ tính câu có trả lời, hallucination rate là 72% so với 83%, và số câu đúng, mọi claim có căn cứ không tăng (5 so với 5, mục 7.5). Trên đúng các câu cả hai hệ cùng trả lời, câu trả lời của Self-RAG ít claim không có căn cứ hơn, nên Self-RAG không chỉ chọn câu dễ; faithfulness trung bình thì không đủ bằng chứng để phân biệt. Answer relevancy giảm từ 0,70 xuống 0,42 và độ đúng so với ground truth giảm, cũng do refuse nhiều hơn. Ở câu hỏi out-of-corpus, cả hai hệ đều refuse đúng toàn bộ. Trong cài đặt này, vòng tự kiểm tra của Self-RAG chủ yếu hoạt động như một cơ chế refuse có chọn lọc: ở cùng coverage, nó không tốt hơn rõ rệt so với một quy tắc refuse theo ngưỡng cosine không cần gọi thêm LLM, trong khi tốn thời gian gấp nhiều lần. Thêm đoạn nhiễu ngẫu nhiên không làm RAG thuần kém đi; cải thiện ở top-k = 8 đến từ việc có thêm bằng chứng liên quan.</w:t>
+        <w:t>Trên 144 câu hỏi, với top-k = 4: ở câu hỏi một đoạn, không đủ bằng chứng để phân biệt LangChain RAG và LangGraph Self-RAG (bản xấp xỉ bằng prompt trên mô hình 7B) trên cả ba chỉ số. Ở câu hỏi tổng hợp hai bài, Self-RAG giảm hallucination rate từ 71% xuống 37%, nhưng mức giảm này chủ yếu do refuse nhiều hơn: chỉ tính câu có trả lời, hallucination rate là 72% so với 83%, và số câu đúng, mọi claim có căn cứ không tăng (5 so với 5, mục 7.5). Trên đúng các câu cả hai hệ cùng trả lời, câu trả lời của Self-RAG ít claim không có căn cứ hơn, nên Self-RAG không chỉ chọn câu dễ; faithfulness trung bình thì không đủ bằng chứng để phân biệt. Answer relevancy giảm từ 0,70 xuống 0,42 và độ đúng so với ground truth giảm, cũng do refuse nhiều hơn. Ở câu hỏi out-of-corpus, cả hai hệ đều refuse đúng toàn bộ. Trong cài đặt này, vòng tự kiểm tra của Self-RAG chủ yếu hoạt động như một cơ chế refuse có chọn lọc: ở cùng coverage, nó không tốt hơn rõ rệt so với một quy tắc refuse theo ngưỡng cosine không cần gọi thêm LLM, trong khi tốn thời gian gấp nhiều lần. Thêm đoạn nhiễu ngẫu nhiên không làm RAG thuần kém đi; cải thiện ở top-k = 8 đến từ việc có thêm bằng chứng liên quan. Chấm tay cho thấy judge gắn hallucination nhiều hơn người chấm nhiều (mục 7.6): ở câu single-hop, phần lớn câu trả lời bị judge gắn hallucination thực ra có mọi claim được context hỗ trợ, nên các hallucination rate tuyệt đối ở trên là cận trên.</w:t>
       </w:r>
     </w:p>
     <w:p>
@@ -9829,6 +10485,22 @@
           <w:sz w:val="24"/>
         </w:rPr>
         <w:t>[8] A. S. Thakur et al., "Judging the Judges: Evaluating Alignment and Vulnerabilities in LLMs-as-Judges", arXiv:2406.12624, 2024.</w:t>
+      </w:r>
+    </w:p>
+    <w:p>
+      <w:r>
+        <w:rPr>
+          <w:sz w:val="24"/>
+        </w:rPr>
+        <w:t>[9] L. Zheng et al., "Judging LLM-as-a-Judge with MT-Bench and Chatbot Arena", NeurIPS 2023 (arXiv:2306.05685).</w:t>
+      </w:r>
+    </w:p>
+    <w:p>
+      <w:r>
+        <w:rPr>
+          <w:sz w:val="24"/>
+        </w:rPr>
+        <w:t>[10] "When Consistency Does Not Mean Reliability: Evaluating Local LLM Judges Against Human Ratings", arXiv:2609.13824, 2026.</w:t>
       </w:r>
     </w:p>
     <w:sectPr>

</xml_diff>